<commit_message>
Add supplementary evidence review to feedback solutions
</commit_message>
<xml_diff>
--- a/paper/Jawe_OPG_Feedback_Proposed_Solutions.docx
+++ b/paper/Jawe_OPG_Feedback_Proposed_Solutions.docx
@@ -9057,6 +9057,3485 @@
     <w:p>
       <w:r>
         <w:t>For every reference, record the source checked, metadata corrections and date checked. After incorporating approved content, verify citation order, cross-references, symbols, table/figure placement, hanging indents, embedded fonts and the eight-page count. This solutions document does not certify that those final-paper checks or the new analyses have been completed.</w:t>
+      </w:r>
+    </w:p>
+    <w:p>
+      <w:r>
+        <w:br w:type="page"/>
+      </w:r>
+    </w:p>
+    <w:p>
+      <w:pPr>
+        <w:pStyle w:val="Heading1"/>
+      </w:pPr>
+      <w:r>
+        <w:rPr>
+          <w:b w:val="0"/>
+        </w:rPr>
+        <w:t>Addendum — Missing item 1: Supplementary evidence</w:t>
+      </w:r>
+    </w:p>
+    <w:p>
+      <w:r>
+        <w:rPr>
+          <w:b w:val="0"/>
+        </w:rPr>
+      </w:r>
+      <w:r>
+        <w:rPr>
+          <w:b/>
+        </w:rPr>
+        <w:t>Evidence review added: 21 October 2026</w:t>
+      </w:r>
+      <w:r>
+        <w:rPr>
+          <w:b w:val="0"/>
+        </w:rPr>
+      </w:r>
+    </w:p>
+    <w:p>
+      <w:r>
+        <w:rPr>
+          <w:b w:val="0"/>
+        </w:rPr>
+        <w:t>This addendum addresses the first outstanding item in the latest PDF assessment: checking the cited supplementary tables and supporting validation records. The original nine-page solutions document remains the earlier proposal. Its statements that analyses were unperformed predate the additional results now reported in the manuscript and available in GitHub.</w:t>
+      </w:r>
+    </w:p>
+    <w:p>
+      <w:pPr>
+        <w:pStyle w:val="Heading3"/>
+      </w:pPr>
+      <w:r>
+        <w:rPr>
+          <w:b w:val="0"/>
+        </w:rPr>
+        <w:t>Evidence located and checked</w:t>
+      </w:r>
+    </w:p>
+    <w:p>
+      <w:r>
+        <w:rPr>
+          <w:b w:val="0"/>
+        </w:rPr>
+        <w:t xml:space="preserve">The review inspected repository commit </w:t>
+      </w:r>
+      <w:r>
+        <w:rPr>
+          <w:b/>
+        </w:rPr>
+        <w:t>cdcc53be</w:t>
+      </w:r>
+      <w:r>
+        <w:rPr>
+          <w:b w:val="0"/>
+        </w:rPr>
+        <w:t xml:space="preserve"> and the supplied PDF. The repository contains </w:t>
+      </w:r>
+      <w:r>
+        <w:rPr>
+          <w:b/>
+        </w:rPr>
+        <w:t>paper/supplement_screening.md</w:t>
+      </w:r>
+      <w:r>
+        <w:rPr>
+          <w:b w:val="0"/>
+        </w:rPr>
+        <w:t>, with Tables S1–S4, two validation scripts and their saved aggregate outputs. These records were available in GitHub even though the supplement was not attached to the PDF message.</w:t>
+      </w:r>
+    </w:p>
+    <w:tbl>
+      <w:tblPr>
+        <w:tblW w:type="auto" w:w="0"/>
+        <w:jc w:val="center"/>
+        <w:tblLayout w:type="fixed"/>
+        <w:tblLook w:firstColumn="1" w:firstRow="1" w:lastColumn="0" w:lastRow="0" w:noHBand="0" w:noVBand="1" w:val="04A0"/>
+      </w:tblPr>
+      <w:tblGrid>
+        <w:gridCol w:w="2376"/>
+        <w:gridCol w:w="3744"/>
+        <w:gridCol w:w="3758"/>
+      </w:tblGrid>
+      <w:tr>
+        <w:trPr>
+          <w:cantSplit/>
+          <w:tblHeader/>
+        </w:trPr>
+        <w:tc>
+          <w:tcPr>
+            <w:tcW w:type="dxa" w:w="2376"/>
+            <w:vAlign w:val="center"/>
+            <w:shd w:fill="244D68"/>
+            <w:tcMar>
+              <w:top w:w="65" w:type="dxa"/>
+              <w:bottom w:w="65" w:type="dxa"/>
+              <w:left w:w="65" w:type="dxa"/>
+              <w:right w:w="65" w:type="dxa"/>
+            </w:tcMar>
+          </w:tcPr>
+          <w:p>
+            <w:pPr>
+              <w:keepNext w:val="0"/>
+              <w:spacing w:after="20" w:before="20" w:line="245" w:lineRule="auto"/>
+            </w:pPr>
+            <w:r>
+              <w:rPr>
+                <w:b/>
+                <w:color w:val="FFFFFF"/>
+                <w:sz w:val="18"/>
+              </w:rPr>
+              <w:t>Supplement</w:t>
+            </w:r>
+          </w:p>
+        </w:tc>
+        <w:tc>
+          <w:tcPr>
+            <w:tcW w:type="dxa" w:w="3744"/>
+            <w:vAlign w:val="center"/>
+            <w:shd w:fill="244D68"/>
+            <w:tcMar>
+              <w:top w:w="65" w:type="dxa"/>
+              <w:bottom w:w="65" w:type="dxa"/>
+              <w:left w:w="65" w:type="dxa"/>
+              <w:right w:w="65" w:type="dxa"/>
+            </w:tcMar>
+          </w:tcPr>
+          <w:p>
+            <w:pPr>
+              <w:keepNext w:val="0"/>
+              <w:spacing w:after="20" w:before="20" w:line="245" w:lineRule="auto"/>
+            </w:pPr>
+            <w:r>
+              <w:rPr>
+                <w:b/>
+                <w:color w:val="FFFFFF"/>
+                <w:sz w:val="18"/>
+              </w:rPr>
+              <w:t>Evidence found</w:t>
+            </w:r>
+          </w:p>
+        </w:tc>
+        <w:tc>
+          <w:tcPr>
+            <w:tcW w:type="dxa" w:w="3758"/>
+            <w:vAlign w:val="center"/>
+            <w:shd w:fill="244D68"/>
+            <w:tcMar>
+              <w:top w:w="65" w:type="dxa"/>
+              <w:bottom w:w="65" w:type="dxa"/>
+              <w:left w:w="65" w:type="dxa"/>
+              <w:right w:w="65" w:type="dxa"/>
+            </w:tcMar>
+          </w:tcPr>
+          <w:p>
+            <w:pPr>
+              <w:keepNext w:val="0"/>
+              <w:spacing w:after="20" w:before="20" w:line="245" w:lineRule="auto"/>
+            </w:pPr>
+            <w:r>
+              <w:rPr>
+                <w:b/>
+                <w:color w:val="FFFFFF"/>
+                <w:sz w:val="18"/>
+              </w:rPr>
+              <w:t>Finding</w:t>
+            </w:r>
+          </w:p>
+        </w:tc>
+      </w:tr>
+      <w:tr>
+        <w:trPr>
+          <w:cantSplit/>
+        </w:trPr>
+        <w:tc>
+          <w:tcPr>
+            <w:tcW w:type="dxa" w:w="2376"/>
+            <w:vAlign w:val="center"/>
+            <w:shd w:fill="F0F5F8"/>
+            <w:tcMar>
+              <w:top w:w="65" w:type="dxa"/>
+              <w:bottom w:w="65" w:type="dxa"/>
+              <w:left w:w="65" w:type="dxa"/>
+              <w:right w:w="65" w:type="dxa"/>
+            </w:tcMar>
+          </w:tcPr>
+          <w:p>
+            <w:pPr>
+              <w:keepNext w:val="0"/>
+              <w:spacing w:after="20" w:before="20" w:line="245" w:lineRule="auto"/>
+            </w:pPr>
+            <w:r>
+              <w:rPr>
+                <w:b w:val="0"/>
+                <w:sz w:val="18"/>
+              </w:rPr>
+              <w:t>S1: screening scenarios</w:t>
+            </w:r>
+          </w:p>
+        </w:tc>
+        <w:tc>
+          <w:tcPr>
+            <w:tcW w:type="dxa" w:w="3744"/>
+            <w:vAlign w:val="center"/>
+            <w:shd w:fill="F0F5F8"/>
+            <w:tcMar>
+              <w:top w:w="65" w:type="dxa"/>
+              <w:bottom w:w="65" w:type="dxa"/>
+              <w:left w:w="65" w:type="dxa"/>
+              <w:right w:w="65" w:type="dxa"/>
+            </w:tcMar>
+          </w:tcPr>
+          <w:p>
+            <w:pPr>
+              <w:keepNext w:val="0"/>
+              <w:spacing w:after="20" w:before="20" w:line="245" w:lineRule="auto"/>
+            </w:pPr>
+            <w:r>
+              <w:rPr>
+                <w:b w:val="0"/>
+                <w:sz w:val="18"/>
+              </w:rPr>
+              <w:t>Definitions and results for 16 scenarios; descriptive and model-sensitivity CSVs; run record.</w:t>
+            </w:r>
+          </w:p>
+        </w:tc>
+        <w:tc>
+          <w:tcPr>
+            <w:tcW w:type="dxa" w:w="3758"/>
+            <w:vAlign w:val="center"/>
+            <w:shd w:fill="F0F5F8"/>
+            <w:tcMar>
+              <w:top w:w="65" w:type="dxa"/>
+              <w:bottom w:w="65" w:type="dxa"/>
+              <w:left w:w="65" w:type="dxa"/>
+              <w:right w:w="65" w:type="dxa"/>
+            </w:tcMar>
+          </w:tcPr>
+          <w:p>
+            <w:pPr>
+              <w:keepNext w:val="0"/>
+              <w:spacing w:after="20" w:before="20" w:line="245" w:lineRule="auto"/>
+            </w:pPr>
+            <w:r>
+              <w:rPr>
+                <w:b w:val="0"/>
+                <w:sz w:val="18"/>
+              </w:rPr>
+              <w:t>All 160 numerical fields and 16 fit-status labels match the saved outputs.</w:t>
+            </w:r>
+          </w:p>
+        </w:tc>
+      </w:tr>
+      <w:tr>
+        <w:trPr>
+          <w:cantSplit/>
+        </w:trPr>
+        <w:tc>
+          <w:tcPr>
+            <w:tcW w:type="dxa" w:w="2376"/>
+            <w:vAlign w:val="center"/>
+            <w:shd w:fill="FFFFFF"/>
+            <w:tcMar>
+              <w:top w:w="65" w:type="dxa"/>
+              <w:bottom w:w="65" w:type="dxa"/>
+              <w:left w:w="65" w:type="dxa"/>
+              <w:right w:w="65" w:type="dxa"/>
+            </w:tcMar>
+          </w:tcPr>
+          <w:p>
+            <w:pPr>
+              <w:keepNext w:val="0"/>
+              <w:spacing w:after="20" w:before="20" w:line="245" w:lineRule="auto"/>
+            </w:pPr>
+            <w:r>
+              <w:rPr>
+                <w:b w:val="0"/>
+                <w:sz w:val="18"/>
+              </w:rPr>
+              <w:t>S2: ridge comparison</w:t>
+            </w:r>
+          </w:p>
+        </w:tc>
+        <w:tc>
+          <w:tcPr>
+            <w:tcW w:type="dxa" w:w="3744"/>
+            <w:vAlign w:val="center"/>
+            <w:shd w:fill="FFFFFF"/>
+            <w:tcMar>
+              <w:top w:w="65" w:type="dxa"/>
+              <w:bottom w:w="65" w:type="dxa"/>
+              <w:left w:w="65" w:type="dxa"/>
+              <w:right w:w="65" w:type="dxa"/>
+            </w:tcMar>
+          </w:tcPr>
+          <w:p>
+            <w:pPr>
+              <w:keepNext w:val="0"/>
+              <w:spacing w:after="20" w:before="20" w:line="245" w:lineRule="auto"/>
+            </w:pPr>
+            <w:r>
+              <w:rPr>
+                <w:b w:val="0"/>
+                <w:sz w:val="18"/>
+              </w:rPr>
+              <w:t>Metrics, ten fold-penalty records, run record and analysis script.</w:t>
+            </w:r>
+          </w:p>
+        </w:tc>
+        <w:tc>
+          <w:tcPr>
+            <w:tcW w:type="dxa" w:w="3758"/>
+            <w:vAlign w:val="center"/>
+            <w:shd w:fill="FFFFFF"/>
+            <w:tcMar>
+              <w:top w:w="65" w:type="dxa"/>
+              <w:bottom w:w="65" w:type="dxa"/>
+              <w:left w:w="65" w:type="dxa"/>
+              <w:right w:w="65" w:type="dxa"/>
+            </w:tcMar>
+          </w:tcPr>
+          <w:p>
+            <w:pPr>
+              <w:keepNext w:val="0"/>
+              <w:spacing w:after="20" w:before="20" w:line="245" w:lineRule="auto"/>
+            </w:pPr>
+            <w:r>
+              <w:rPr>
+                <w:b w:val="0"/>
+                <w:sz w:val="18"/>
+              </w:rPr>
+              <w:t>Recorded results support the reported comparison; a preprocessing qualification is explained on the next page.</w:t>
+            </w:r>
+          </w:p>
+        </w:tc>
+      </w:tr>
+      <w:tr>
+        <w:trPr>
+          <w:cantSplit/>
+        </w:trPr>
+        <w:tc>
+          <w:tcPr>
+            <w:tcW w:type="dxa" w:w="2376"/>
+            <w:vAlign w:val="center"/>
+            <w:shd w:fill="F0F5F8"/>
+            <w:tcMar>
+              <w:top w:w="65" w:type="dxa"/>
+              <w:bottom w:w="65" w:type="dxa"/>
+              <w:left w:w="65" w:type="dxa"/>
+              <w:right w:w="65" w:type="dxa"/>
+            </w:tcMar>
+          </w:tcPr>
+          <w:p>
+            <w:pPr>
+              <w:keepNext w:val="0"/>
+              <w:spacing w:after="20" w:before="20" w:line="245" w:lineRule="auto"/>
+            </w:pPr>
+            <w:r>
+              <w:rPr>
+                <w:b w:val="0"/>
+                <w:sz w:val="18"/>
+              </w:rPr>
+              <w:t>S3: repeated refitting</w:t>
+            </w:r>
+          </w:p>
+        </w:tc>
+        <w:tc>
+          <w:tcPr>
+            <w:tcW w:type="dxa" w:w="3744"/>
+            <w:vAlign w:val="center"/>
+            <w:shd w:fill="F0F5F8"/>
+            <w:tcMar>
+              <w:top w:w="65" w:type="dxa"/>
+              <w:bottom w:w="65" w:type="dxa"/>
+              <w:left w:w="65" w:type="dxa"/>
+              <w:right w:w="65" w:type="dxa"/>
+            </w:tcMar>
+          </w:tcPr>
+          <w:p>
+            <w:pPr>
+              <w:keepNext w:val="0"/>
+              <w:spacing w:after="20" w:before="20" w:line="245" w:lineRule="auto"/>
+            </w:pPr>
+            <w:r>
+              <w:rPr>
+                <w:b w:val="0"/>
+                <w:sz w:val="18"/>
+              </w:rPr>
+              <w:t>Twenty repetition rows, 100 coefficient/fit records, five metric summaries, six coefficient summaries and run record.</w:t>
+            </w:r>
+          </w:p>
+        </w:tc>
+        <w:tc>
+          <w:tcPr>
+            <w:tcW w:type="dxa" w:w="3758"/>
+            <w:vAlign w:val="center"/>
+            <w:shd w:fill="F0F5F8"/>
+            <w:tcMar>
+              <w:top w:w="65" w:type="dxa"/>
+              <w:bottom w:w="65" w:type="dxa"/>
+              <w:left w:w="65" w:type="dxa"/>
+              <w:right w:w="65" w:type="dxa"/>
+            </w:tcMar>
+          </w:tcPr>
+          <w:p>
+            <w:pPr>
+              <w:keepNext w:val="0"/>
+              <w:spacing w:after="20" w:before="20" w:line="245" w:lineRule="auto"/>
+            </w:pPr>
+            <w:r>
+              <w:rPr>
+                <w:b w:val="0"/>
+                <w:sz w:val="18"/>
+              </w:rPr>
+              <w:t>Saved summary calculations and convergence/sign counts agree with the detailed CSVs.</w:t>
+            </w:r>
+          </w:p>
+        </w:tc>
+      </w:tr>
+      <w:tr>
+        <w:trPr>
+          <w:cantSplit/>
+        </w:trPr>
+        <w:tc>
+          <w:tcPr>
+            <w:tcW w:type="dxa" w:w="2376"/>
+            <w:vAlign w:val="center"/>
+            <w:shd w:fill="FFFFFF"/>
+            <w:tcMar>
+              <w:top w:w="65" w:type="dxa"/>
+              <w:bottom w:w="65" w:type="dxa"/>
+              <w:left w:w="65" w:type="dxa"/>
+              <w:right w:w="65" w:type="dxa"/>
+            </w:tcMar>
+          </w:tcPr>
+          <w:p>
+            <w:pPr>
+              <w:keepNext w:val="0"/>
+              <w:spacing w:after="20" w:before="20" w:line="245" w:lineRule="auto"/>
+            </w:pPr>
+            <w:r>
+              <w:rPr>
+                <w:b w:val="0"/>
+                <w:sz w:val="18"/>
+              </w:rPr>
+              <w:t>S4: weighted/unweighted descriptions</w:t>
+            </w:r>
+          </w:p>
+        </w:tc>
+        <w:tc>
+          <w:tcPr>
+            <w:tcW w:type="dxa" w:w="3744"/>
+            <w:vAlign w:val="center"/>
+            <w:shd w:fill="FFFFFF"/>
+            <w:tcMar>
+              <w:top w:w="65" w:type="dxa"/>
+              <w:bottom w:w="65" w:type="dxa"/>
+              <w:left w:w="65" w:type="dxa"/>
+              <w:right w:w="65" w:type="dxa"/>
+            </w:tcMar>
+          </w:tcPr>
+          <w:p>
+            <w:pPr>
+              <w:keepNext w:val="0"/>
+              <w:spacing w:after="20" w:before="20" w:line="245" w:lineRule="auto"/>
+            </w:pPr>
+            <w:r>
+              <w:rPr>
+                <w:b w:val="0"/>
+                <w:sz w:val="18"/>
+              </w:rPr>
+              <w:t>Seven-row supplementary table and retained descriptive CSV.</w:t>
+            </w:r>
+          </w:p>
+        </w:tc>
+        <w:tc>
+          <w:tcPr>
+            <w:tcW w:type="dxa" w:w="3758"/>
+            <w:vAlign w:val="center"/>
+            <w:shd w:fill="FFFFFF"/>
+            <w:tcMar>
+              <w:top w:w="65" w:type="dxa"/>
+              <w:bottom w:w="65" w:type="dxa"/>
+              <w:left w:w="65" w:type="dxa"/>
+              <w:right w:w="65" w:type="dxa"/>
+            </w:tcMar>
+          </w:tcPr>
+          <w:p>
+            <w:pPr>
+              <w:keepNext w:val="0"/>
+              <w:spacing w:after="20" w:before="20" w:line="245" w:lineRule="auto"/>
+            </w:pPr>
+            <w:r>
+              <w:rPr>
+                <w:b w:val="0"/>
+                <w:sz w:val="18"/>
+              </w:rPr>
+              <w:t>All 40 scalar values match the saved descriptive output.</w:t>
+            </w:r>
+          </w:p>
+        </w:tc>
+      </w:tr>
+      <w:tr>
+        <w:trPr>
+          <w:cantSplit/>
+        </w:trPr>
+        <w:tc>
+          <w:tcPr>
+            <w:tcW w:type="dxa" w:w="2376"/>
+            <w:vAlign w:val="center"/>
+            <w:shd w:fill="F0F5F8"/>
+            <w:tcMar>
+              <w:top w:w="65" w:type="dxa"/>
+              <w:bottom w:w="65" w:type="dxa"/>
+              <w:left w:w="65" w:type="dxa"/>
+              <w:right w:w="65" w:type="dxa"/>
+            </w:tcMar>
+          </w:tcPr>
+          <w:p>
+            <w:pPr>
+              <w:keepNext w:val="0"/>
+              <w:spacing w:after="20" w:before="20" w:line="245" w:lineRule="auto"/>
+            </w:pPr>
+            <w:r>
+              <w:rPr>
+                <w:b w:val="0"/>
+                <w:sz w:val="18"/>
+              </w:rPr>
+              <w:t>S5: literature-search audit</w:t>
+            </w:r>
+          </w:p>
+        </w:tc>
+        <w:tc>
+          <w:tcPr>
+            <w:tcW w:type="dxa" w:w="3744"/>
+            <w:vAlign w:val="center"/>
+            <w:shd w:fill="F0F5F8"/>
+            <w:tcMar>
+              <w:top w:w="65" w:type="dxa"/>
+              <w:bottom w:w="65" w:type="dxa"/>
+              <w:left w:w="65" w:type="dxa"/>
+              <w:right w:w="65" w:type="dxa"/>
+            </w:tcMar>
+          </w:tcPr>
+          <w:p>
+            <w:pPr>
+              <w:keepNext w:val="0"/>
+              <w:spacing w:after="20" w:before="20" w:line="245" w:lineRule="auto"/>
+            </w:pPr>
+            <w:r>
+              <w:rPr>
+                <w:b w:val="0"/>
+                <w:sz w:val="18"/>
+              </w:rPr>
+              <w:t>Exact queries, date and source counts recovered from a separate recorded manuscript revision.</w:t>
+            </w:r>
+          </w:p>
+        </w:tc>
+        <w:tc>
+          <w:tcPr>
+            <w:tcW w:type="dxa" w:w="3758"/>
+            <w:vAlign w:val="center"/>
+            <w:shd w:fill="F0F5F8"/>
+            <w:tcMar>
+              <w:top w:w="65" w:type="dxa"/>
+              <w:bottom w:w="65" w:type="dxa"/>
+              <w:left w:w="65" w:type="dxa"/>
+              <w:right w:w="65" w:type="dxa"/>
+            </w:tcMar>
+          </w:tcPr>
+          <w:p>
+            <w:pPr>
+              <w:keepNext w:val="0"/>
+              <w:spacing w:after="20" w:before="20" w:line="245" w:lineRule="auto"/>
+            </w:pPr>
+            <w:r>
+              <w:rPr>
+                <w:b w:val="0"/>
+                <w:sz w:val="18"/>
+              </w:rPr>
+              <w:t>The underlying workbook, exports and item-level screening record were not located in the inspected repository snapshots.</w:t>
+            </w:r>
+          </w:p>
+        </w:tc>
+      </w:tr>
+    </w:tbl>
+    <w:p>
+      <w:pPr>
+        <w:spacing w:after="0"/>
+      </w:pPr>
+    </w:p>
+    <w:p>
+      <w:pPr>
+        <w:pStyle w:val="Heading3"/>
+      </w:pPr>
+      <w:r>
+        <w:rPr>
+          <w:b w:val="0"/>
+        </w:rPr>
+        <w:t>What this verification establishes</w:t>
+      </w:r>
+    </w:p>
+    <w:p>
+      <w:r>
+        <w:rPr>
+          <w:b w:val="0"/>
+        </w:rPr>
+        <w:t xml:space="preserve">S1 distinguishes </w:t>
+      </w:r>
+      <w:r>
+        <w:rPr>
+          <w:b/>
+        </w:rPr>
+        <w:t>one primary, seven reused and eight refitted</w:t>
+      </w:r>
+      <w:r>
+        <w:rPr>
+          <w:b w:val="0"/>
+        </w:rPr>
+        <w:t xml:space="preserve"> screening scenarios. The saved run record confirms that S1b and S1d selected the same people. S4 supports the clearer weighted/unweighted presentation. These findings strengthen the evidence for supervisor comments 3 and 4.</w:t>
+      </w:r>
+    </w:p>
+    <w:p>
+      <w:r>
+        <w:rPr>
+          <w:b w:val="0"/>
+        </w:rPr>
+        <w:t>For S2–S3, the review checked source-code structure and recalculated saved aggregate summaries. It did not independently refit the models or recompute the new AUC values from saved individual predictions. The new scripts do not retain those prediction files. A consistent saved summary is useful evidence, but it is distinct from fresh execution of the complete analysis.</w:t>
+      </w:r>
+    </w:p>
+    <w:p>
+      <w:r>
+        <w:rPr>
+          <w:b w:val="0"/>
+        </w:rPr>
+      </w:r>
+      <w:r>
+        <w:rPr>
+          <w:b/>
+        </w:rPr>
+        <w:t>Current status:</w:t>
+      </w:r>
+      <w:r>
+        <w:rPr>
+          <w:b w:val="0"/>
+        </w:rPr>
+        <w:t xml:space="preserve"> S1 and S4 are supported by the available records. S3 is supported at the code-and-saved-summary level. S2 needs the qualification below. S5 still requires its underlying screening evidence before full auditability can be confirmed.</w:t>
+      </w:r>
+    </w:p>
+    <w:p>
+      <w:pPr>
+        <w:spacing w:after="100"/>
+      </w:pPr>
+      <w:hyperlink r:id="rId11">
+        <w:r>
+          <w:rPr>
+            <w:color w:val="245D88"/>
+            <w:u w:val="single"/>
+            <w:sz w:val="19"/>
+          </w:rPr>
+          <w:t>Main supplementary tables and methods</w:t>
+        </w:r>
+      </w:hyperlink>
+    </w:p>
+    <w:p>
+      <w:r>
+        <w:br w:type="page"/>
+      </w:r>
+    </w:p>
+    <w:p>
+      <w:pPr>
+        <w:pStyle w:val="Heading1"/>
+      </w:pPr>
+      <w:r>
+        <w:rPr>
+          <w:b w:val="0"/>
+        </w:rPr>
+        <w:t>Missing item 1 — Validation evidence</w:t>
+      </w:r>
+    </w:p>
+    <w:p>
+      <w:pPr>
+        <w:pStyle w:val="Heading3"/>
+      </w:pPr>
+      <w:r>
+        <w:rPr>
+          <w:b w:val="0"/>
+        </w:rPr>
+        <w:t>Supplement S2: ridge settlement comparison</w:t>
+      </w:r>
+    </w:p>
+    <w:p>
+      <w:r>
+        <w:rPr>
+          <w:b w:val="0"/>
+        </w:rPr>
+        <w:t xml:space="preserve">The saved comparison uses the same cohort and outer household folds. It selects inverse penalty strength </w:t>
+      </w:r>
+      <w:r>
+        <w:rPr>
+          <w:b/>
+        </w:rPr>
+        <w:t>C</w:t>
+      </w:r>
+      <w:r>
+        <w:rPr>
+          <w:b w:val="0"/>
+        </w:rPr>
+        <w:t xml:space="preserve"> from 0.01, 0.1, 0.3, 1, 3, 10, 30 and 100 using mean Brier score over five inner household-grouped folds. All ten outer fits selected C = 0.1 and were recorded as converged. Smaller C means stronger penalisation.</w:t>
+      </w:r>
+    </w:p>
+    <w:tbl>
+      <w:tblPr>
+        <w:tblW w:type="auto" w:w="0"/>
+        <w:jc w:val="center"/>
+        <w:tblLayout w:type="fixed"/>
+        <w:tblLook w:firstColumn="1" w:firstRow="1" w:lastColumn="0" w:lastRow="0" w:noHBand="0" w:noVBand="1" w:val="04A0"/>
+      </w:tblPr>
+      <w:tblGrid>
+        <w:gridCol w:w="3398"/>
+        <w:gridCol w:w="1296"/>
+        <w:gridCol w:w="1296"/>
+        <w:gridCol w:w="1296"/>
+        <w:gridCol w:w="1296"/>
+        <w:gridCol w:w="1296"/>
+      </w:tblGrid>
+      <w:tr>
+        <w:trPr>
+          <w:cantSplit/>
+          <w:tblHeader/>
+        </w:trPr>
+        <w:tc>
+          <w:tcPr>
+            <w:tcW w:type="dxa" w:w="3398"/>
+            <w:vAlign w:val="center"/>
+            <w:shd w:fill="244D68"/>
+            <w:tcMar>
+              <w:top w:w="65" w:type="dxa"/>
+              <w:bottom w:w="65" w:type="dxa"/>
+              <w:left w:w="65" w:type="dxa"/>
+              <w:right w:w="65" w:type="dxa"/>
+            </w:tcMar>
+          </w:tcPr>
+          <w:p>
+            <w:pPr>
+              <w:keepNext w:val="0"/>
+              <w:spacing w:after="20" w:before="20" w:line="245" w:lineRule="auto"/>
+            </w:pPr>
+            <w:r>
+              <w:rPr>
+                <w:b/>
+                <w:color w:val="FFFFFF"/>
+                <w:sz w:val="17"/>
+              </w:rPr>
+              <w:t>Recorded configuration</w:t>
+            </w:r>
+          </w:p>
+        </w:tc>
+        <w:tc>
+          <w:tcPr>
+            <w:tcW w:type="dxa" w:w="1296"/>
+            <w:vAlign w:val="center"/>
+            <w:shd w:fill="244D68"/>
+            <w:tcMar>
+              <w:top w:w="65" w:type="dxa"/>
+              <w:bottom w:w="65" w:type="dxa"/>
+              <w:left w:w="65" w:type="dxa"/>
+              <w:right w:w="65" w:type="dxa"/>
+            </w:tcMar>
+          </w:tcPr>
+          <w:p>
+            <w:pPr>
+              <w:keepNext w:val="0"/>
+              <w:spacing w:after="20" w:before="20" w:line="245" w:lineRule="auto"/>
+            </w:pPr>
+            <w:r>
+              <w:rPr>
+                <w:b/>
+                <w:color w:val="FFFFFF"/>
+                <w:sz w:val="17"/>
+              </w:rPr>
+              <w:t>AUC</w:t>
+            </w:r>
+          </w:p>
+        </w:tc>
+        <w:tc>
+          <w:tcPr>
+            <w:tcW w:type="dxa" w:w="1296"/>
+            <w:vAlign w:val="center"/>
+            <w:shd w:fill="244D68"/>
+            <w:tcMar>
+              <w:top w:w="65" w:type="dxa"/>
+              <w:bottom w:w="65" w:type="dxa"/>
+              <w:left w:w="65" w:type="dxa"/>
+              <w:right w:w="65" w:type="dxa"/>
+            </w:tcMar>
+          </w:tcPr>
+          <w:p>
+            <w:pPr>
+              <w:keepNext w:val="0"/>
+              <w:spacing w:after="20" w:before="20" w:line="245" w:lineRule="auto"/>
+            </w:pPr>
+            <w:r>
+              <w:rPr>
+                <w:b/>
+                <w:color w:val="FFFFFF"/>
+                <w:sz w:val="17"/>
+              </w:rPr>
+              <w:t>AP</w:t>
+            </w:r>
+          </w:p>
+        </w:tc>
+        <w:tc>
+          <w:tcPr>
+            <w:tcW w:type="dxa" w:w="1296"/>
+            <w:vAlign w:val="center"/>
+            <w:shd w:fill="244D68"/>
+            <w:tcMar>
+              <w:top w:w="65" w:type="dxa"/>
+              <w:bottom w:w="65" w:type="dxa"/>
+              <w:left w:w="65" w:type="dxa"/>
+              <w:right w:w="65" w:type="dxa"/>
+            </w:tcMar>
+          </w:tcPr>
+          <w:p>
+            <w:pPr>
+              <w:keepNext w:val="0"/>
+              <w:spacing w:after="20" w:before="20" w:line="245" w:lineRule="auto"/>
+            </w:pPr>
+            <w:r>
+              <w:rPr>
+                <w:b/>
+                <w:color w:val="FFFFFF"/>
+                <w:sz w:val="17"/>
+              </w:rPr>
+              <w:t>Brier</w:t>
+            </w:r>
+          </w:p>
+        </w:tc>
+        <w:tc>
+          <w:tcPr>
+            <w:tcW w:type="dxa" w:w="1296"/>
+            <w:vAlign w:val="center"/>
+            <w:shd w:fill="244D68"/>
+            <w:tcMar>
+              <w:top w:w="65" w:type="dxa"/>
+              <w:bottom w:w="65" w:type="dxa"/>
+              <w:left w:w="65" w:type="dxa"/>
+              <w:right w:w="65" w:type="dxa"/>
+            </w:tcMar>
+          </w:tcPr>
+          <w:p>
+            <w:pPr>
+              <w:keepNext w:val="0"/>
+              <w:spacing w:after="20" w:before="20" w:line="245" w:lineRule="auto"/>
+            </w:pPr>
+            <w:r>
+              <w:rPr>
+                <w:b/>
+                <w:color w:val="FFFFFF"/>
+                <w:sz w:val="17"/>
+              </w:rPr>
+              <w:t>CITL</w:t>
+            </w:r>
+          </w:p>
+        </w:tc>
+        <w:tc>
+          <w:tcPr>
+            <w:tcW w:type="dxa" w:w="1296"/>
+            <w:vAlign w:val="center"/>
+            <w:shd w:fill="244D68"/>
+            <w:tcMar>
+              <w:top w:w="65" w:type="dxa"/>
+              <w:bottom w:w="65" w:type="dxa"/>
+              <w:left w:w="65" w:type="dxa"/>
+              <w:right w:w="65" w:type="dxa"/>
+            </w:tcMar>
+          </w:tcPr>
+          <w:p>
+            <w:pPr>
+              <w:keepNext w:val="0"/>
+              <w:spacing w:after="20" w:before="20" w:line="245" w:lineRule="auto"/>
+            </w:pPr>
+            <w:r>
+              <w:rPr>
+                <w:b/>
+                <w:color w:val="FFFFFF"/>
+                <w:sz w:val="17"/>
+              </w:rPr>
+              <w:t>Slope</w:t>
+            </w:r>
+          </w:p>
+        </w:tc>
+      </w:tr>
+      <w:tr>
+        <w:trPr>
+          <w:cantSplit/>
+        </w:trPr>
+        <w:tc>
+          <w:tcPr>
+            <w:tcW w:type="dxa" w:w="3398"/>
+            <w:vAlign w:val="center"/>
+            <w:shd w:fill="F0F5F8"/>
+            <w:tcMar>
+              <w:top w:w="65" w:type="dxa"/>
+              <w:bottom w:w="65" w:type="dxa"/>
+              <w:left w:w="65" w:type="dxa"/>
+              <w:right w:w="65" w:type="dxa"/>
+            </w:tcMar>
+          </w:tcPr>
+          <w:p>
+            <w:pPr>
+              <w:keepNext w:val="0"/>
+              <w:spacing w:after="20" w:before="20" w:line="245" w:lineRule="auto"/>
+            </w:pPr>
+            <w:r>
+              <w:rPr>
+                <w:b w:val="0"/>
+                <w:sz w:val="17"/>
+              </w:rPr>
+              <w:t>Ordinary merged reference</w:t>
+            </w:r>
+          </w:p>
+        </w:tc>
+        <w:tc>
+          <w:tcPr>
+            <w:tcW w:type="dxa" w:w="1296"/>
+            <w:vAlign w:val="center"/>
+            <w:shd w:fill="F0F5F8"/>
+            <w:tcMar>
+              <w:top w:w="65" w:type="dxa"/>
+              <w:bottom w:w="65" w:type="dxa"/>
+              <w:left w:w="65" w:type="dxa"/>
+              <w:right w:w="65" w:type="dxa"/>
+            </w:tcMar>
+          </w:tcPr>
+          <w:p>
+            <w:pPr>
+              <w:keepNext w:val="0"/>
+              <w:spacing w:after="20" w:before="20" w:line="245" w:lineRule="auto"/>
+            </w:pPr>
+            <w:r>
+              <w:rPr>
+                <w:b w:val="0"/>
+                <w:sz w:val="17"/>
+              </w:rPr>
+              <w:t>0.752</w:t>
+            </w:r>
+          </w:p>
+        </w:tc>
+        <w:tc>
+          <w:tcPr>
+            <w:tcW w:type="dxa" w:w="1296"/>
+            <w:vAlign w:val="center"/>
+            <w:shd w:fill="F0F5F8"/>
+            <w:tcMar>
+              <w:top w:w="65" w:type="dxa"/>
+              <w:bottom w:w="65" w:type="dxa"/>
+              <w:left w:w="65" w:type="dxa"/>
+              <w:right w:w="65" w:type="dxa"/>
+            </w:tcMar>
+          </w:tcPr>
+          <w:p>
+            <w:pPr>
+              <w:keepNext w:val="0"/>
+              <w:spacing w:after="20" w:before="20" w:line="245" w:lineRule="auto"/>
+            </w:pPr>
+            <w:r>
+              <w:rPr>
+                <w:b w:val="0"/>
+                <w:sz w:val="17"/>
+              </w:rPr>
+              <w:t>0.203</w:t>
+            </w:r>
+          </w:p>
+        </w:tc>
+        <w:tc>
+          <w:tcPr>
+            <w:tcW w:type="dxa" w:w="1296"/>
+            <w:vAlign w:val="center"/>
+            <w:shd w:fill="F0F5F8"/>
+            <w:tcMar>
+              <w:top w:w="65" w:type="dxa"/>
+              <w:bottom w:w="65" w:type="dxa"/>
+              <w:left w:w="65" w:type="dxa"/>
+              <w:right w:w="65" w:type="dxa"/>
+            </w:tcMar>
+          </w:tcPr>
+          <w:p>
+            <w:pPr>
+              <w:keepNext w:val="0"/>
+              <w:spacing w:after="20" w:before="20" w:line="245" w:lineRule="auto"/>
+            </w:pPr>
+            <w:r>
+              <w:rPr>
+                <w:b w:val="0"/>
+                <w:sz w:val="17"/>
+              </w:rPr>
+              <w:t>0.0578</w:t>
+            </w:r>
+          </w:p>
+        </w:tc>
+        <w:tc>
+          <w:tcPr>
+            <w:tcW w:type="dxa" w:w="1296"/>
+            <w:vAlign w:val="center"/>
+            <w:shd w:fill="F0F5F8"/>
+            <w:tcMar>
+              <w:top w:w="65" w:type="dxa"/>
+              <w:bottom w:w="65" w:type="dxa"/>
+              <w:left w:w="65" w:type="dxa"/>
+              <w:right w:w="65" w:type="dxa"/>
+            </w:tcMar>
+          </w:tcPr>
+          <w:p>
+            <w:pPr>
+              <w:keepNext w:val="0"/>
+              <w:spacing w:after="20" w:before="20" w:line="245" w:lineRule="auto"/>
+            </w:pPr>
+            <w:r>
+              <w:rPr>
+                <w:b w:val="0"/>
+                <w:sz w:val="17"/>
+              </w:rPr>
+              <w:t>0.020</w:t>
+            </w:r>
+          </w:p>
+        </w:tc>
+        <w:tc>
+          <w:tcPr>
+            <w:tcW w:type="dxa" w:w="1296"/>
+            <w:vAlign w:val="center"/>
+            <w:shd w:fill="F0F5F8"/>
+            <w:tcMar>
+              <w:top w:w="65" w:type="dxa"/>
+              <w:bottom w:w="65" w:type="dxa"/>
+              <w:left w:w="65" w:type="dxa"/>
+              <w:right w:w="65" w:type="dxa"/>
+            </w:tcMar>
+          </w:tcPr>
+          <w:p>
+            <w:pPr>
+              <w:keepNext w:val="0"/>
+              <w:spacing w:after="20" w:before="20" w:line="245" w:lineRule="auto"/>
+            </w:pPr>
+            <w:r>
+              <w:rPr>
+                <w:b w:val="0"/>
+                <w:sz w:val="17"/>
+              </w:rPr>
+              <w:t>0.836</w:t>
+            </w:r>
+          </w:p>
+        </w:tc>
+      </w:tr>
+      <w:tr>
+        <w:trPr>
+          <w:cantSplit/>
+        </w:trPr>
+        <w:tc>
+          <w:tcPr>
+            <w:tcW w:type="dxa" w:w="3398"/>
+            <w:vAlign w:val="center"/>
+            <w:shd w:fill="FFFFFF"/>
+            <w:tcMar>
+              <w:top w:w="65" w:type="dxa"/>
+              <w:bottom w:w="65" w:type="dxa"/>
+              <w:left w:w="65" w:type="dxa"/>
+              <w:right w:w="65" w:type="dxa"/>
+            </w:tcMar>
+          </w:tcPr>
+          <w:p>
+            <w:pPr>
+              <w:keepNext w:val="0"/>
+              <w:spacing w:after="20" w:before="20" w:line="245" w:lineRule="auto"/>
+            </w:pPr>
+            <w:r>
+              <w:rPr>
+                <w:b w:val="0"/>
+                <w:sz w:val="17"/>
+              </w:rPr>
+              <w:t>Ridge: merged</w:t>
+            </w:r>
+          </w:p>
+        </w:tc>
+        <w:tc>
+          <w:tcPr>
+            <w:tcW w:type="dxa" w:w="1296"/>
+            <w:vAlign w:val="center"/>
+            <w:shd w:fill="FFFFFF"/>
+            <w:tcMar>
+              <w:top w:w="65" w:type="dxa"/>
+              <w:bottom w:w="65" w:type="dxa"/>
+              <w:left w:w="65" w:type="dxa"/>
+              <w:right w:w="65" w:type="dxa"/>
+            </w:tcMar>
+          </w:tcPr>
+          <w:p>
+            <w:pPr>
+              <w:keepNext w:val="0"/>
+              <w:spacing w:after="20" w:before="20" w:line="245" w:lineRule="auto"/>
+            </w:pPr>
+            <w:r>
+              <w:rPr>
+                <w:b w:val="0"/>
+                <w:sz w:val="17"/>
+              </w:rPr>
+              <w:t>0.756</w:t>
+            </w:r>
+          </w:p>
+        </w:tc>
+        <w:tc>
+          <w:tcPr>
+            <w:tcW w:type="dxa" w:w="1296"/>
+            <w:vAlign w:val="center"/>
+            <w:shd w:fill="FFFFFF"/>
+            <w:tcMar>
+              <w:top w:w="65" w:type="dxa"/>
+              <w:bottom w:w="65" w:type="dxa"/>
+              <w:left w:w="65" w:type="dxa"/>
+              <w:right w:w="65" w:type="dxa"/>
+            </w:tcMar>
+          </w:tcPr>
+          <w:p>
+            <w:pPr>
+              <w:keepNext w:val="0"/>
+              <w:spacing w:after="20" w:before="20" w:line="245" w:lineRule="auto"/>
+            </w:pPr>
+            <w:r>
+              <w:rPr>
+                <w:b w:val="0"/>
+                <w:sz w:val="17"/>
+              </w:rPr>
+              <w:t>0.205</w:t>
+            </w:r>
+          </w:p>
+        </w:tc>
+        <w:tc>
+          <w:tcPr>
+            <w:tcW w:type="dxa" w:w="1296"/>
+            <w:vAlign w:val="center"/>
+            <w:shd w:fill="FFFFFF"/>
+            <w:tcMar>
+              <w:top w:w="65" w:type="dxa"/>
+              <w:bottom w:w="65" w:type="dxa"/>
+              <w:left w:w="65" w:type="dxa"/>
+              <w:right w:w="65" w:type="dxa"/>
+            </w:tcMar>
+          </w:tcPr>
+          <w:p>
+            <w:pPr>
+              <w:keepNext w:val="0"/>
+              <w:spacing w:after="20" w:before="20" w:line="245" w:lineRule="auto"/>
+            </w:pPr>
+            <w:r>
+              <w:rPr>
+                <w:b w:val="0"/>
+                <w:sz w:val="17"/>
+              </w:rPr>
+              <w:t>0.0576</w:t>
+            </w:r>
+          </w:p>
+        </w:tc>
+        <w:tc>
+          <w:tcPr>
+            <w:tcW w:type="dxa" w:w="1296"/>
+            <w:vAlign w:val="center"/>
+            <w:shd w:fill="FFFFFF"/>
+            <w:tcMar>
+              <w:top w:w="65" w:type="dxa"/>
+              <w:bottom w:w="65" w:type="dxa"/>
+              <w:left w:w="65" w:type="dxa"/>
+              <w:right w:w="65" w:type="dxa"/>
+            </w:tcMar>
+          </w:tcPr>
+          <w:p>
+            <w:pPr>
+              <w:keepNext w:val="0"/>
+              <w:spacing w:after="20" w:before="20" w:line="245" w:lineRule="auto"/>
+            </w:pPr>
+            <w:r>
+              <w:rPr>
+                <w:b w:val="0"/>
+                <w:sz w:val="17"/>
+              </w:rPr>
+              <w:t>0.013</w:t>
+            </w:r>
+          </w:p>
+        </w:tc>
+        <w:tc>
+          <w:tcPr>
+            <w:tcW w:type="dxa" w:w="1296"/>
+            <w:vAlign w:val="center"/>
+            <w:shd w:fill="FFFFFF"/>
+            <w:tcMar>
+              <w:top w:w="65" w:type="dxa"/>
+              <w:bottom w:w="65" w:type="dxa"/>
+              <w:left w:w="65" w:type="dxa"/>
+              <w:right w:w="65" w:type="dxa"/>
+            </w:tcMar>
+          </w:tcPr>
+          <w:p>
+            <w:pPr>
+              <w:keepNext w:val="0"/>
+              <w:spacing w:after="20" w:before="20" w:line="245" w:lineRule="auto"/>
+            </w:pPr>
+            <w:r>
+              <w:rPr>
+                <w:b w:val="0"/>
+                <w:sz w:val="17"/>
+              </w:rPr>
+              <w:t>0.994</w:t>
+            </w:r>
+          </w:p>
+        </w:tc>
+      </w:tr>
+      <w:tr>
+        <w:trPr>
+          <w:cantSplit/>
+        </w:trPr>
+        <w:tc>
+          <w:tcPr>
+            <w:tcW w:type="dxa" w:w="3398"/>
+            <w:vAlign w:val="center"/>
+            <w:shd w:fill="F0F5F8"/>
+            <w:tcMar>
+              <w:top w:w="65" w:type="dxa"/>
+              <w:bottom w:w="65" w:type="dxa"/>
+              <w:left w:w="65" w:type="dxa"/>
+              <w:right w:w="65" w:type="dxa"/>
+            </w:tcMar>
+          </w:tcPr>
+          <w:p>
+            <w:pPr>
+              <w:keepNext w:val="0"/>
+              <w:spacing w:after="20" w:before="20" w:line="245" w:lineRule="auto"/>
+            </w:pPr>
+            <w:r>
+              <w:rPr>
+                <w:b w:val="0"/>
+                <w:sz w:val="17"/>
+              </w:rPr>
+              <w:t>Ridge: separate</w:t>
+            </w:r>
+          </w:p>
+        </w:tc>
+        <w:tc>
+          <w:tcPr>
+            <w:tcW w:type="dxa" w:w="1296"/>
+            <w:vAlign w:val="center"/>
+            <w:shd w:fill="F0F5F8"/>
+            <w:tcMar>
+              <w:top w:w="65" w:type="dxa"/>
+              <w:bottom w:w="65" w:type="dxa"/>
+              <w:left w:w="65" w:type="dxa"/>
+              <w:right w:w="65" w:type="dxa"/>
+            </w:tcMar>
+          </w:tcPr>
+          <w:p>
+            <w:pPr>
+              <w:keepNext w:val="0"/>
+              <w:spacing w:after="20" w:before="20" w:line="245" w:lineRule="auto"/>
+            </w:pPr>
+            <w:r>
+              <w:rPr>
+                <w:b w:val="0"/>
+                <w:sz w:val="17"/>
+              </w:rPr>
+              <w:t>0.750</w:t>
+            </w:r>
+          </w:p>
+        </w:tc>
+        <w:tc>
+          <w:tcPr>
+            <w:tcW w:type="dxa" w:w="1296"/>
+            <w:vAlign w:val="center"/>
+            <w:shd w:fill="F0F5F8"/>
+            <w:tcMar>
+              <w:top w:w="65" w:type="dxa"/>
+              <w:bottom w:w="65" w:type="dxa"/>
+              <w:left w:w="65" w:type="dxa"/>
+              <w:right w:w="65" w:type="dxa"/>
+            </w:tcMar>
+          </w:tcPr>
+          <w:p>
+            <w:pPr>
+              <w:keepNext w:val="0"/>
+              <w:spacing w:after="20" w:before="20" w:line="245" w:lineRule="auto"/>
+            </w:pPr>
+            <w:r>
+              <w:rPr>
+                <w:b w:val="0"/>
+                <w:sz w:val="17"/>
+              </w:rPr>
+              <w:t>0.205</w:t>
+            </w:r>
+          </w:p>
+        </w:tc>
+        <w:tc>
+          <w:tcPr>
+            <w:tcW w:type="dxa" w:w="1296"/>
+            <w:vAlign w:val="center"/>
+            <w:shd w:fill="F0F5F8"/>
+            <w:tcMar>
+              <w:top w:w="65" w:type="dxa"/>
+              <w:bottom w:w="65" w:type="dxa"/>
+              <w:left w:w="65" w:type="dxa"/>
+              <w:right w:w="65" w:type="dxa"/>
+            </w:tcMar>
+          </w:tcPr>
+          <w:p>
+            <w:pPr>
+              <w:keepNext w:val="0"/>
+              <w:spacing w:after="20" w:before="20" w:line="245" w:lineRule="auto"/>
+            </w:pPr>
+            <w:r>
+              <w:rPr>
+                <w:b w:val="0"/>
+                <w:sz w:val="17"/>
+              </w:rPr>
+              <w:t>0.0577</w:t>
+            </w:r>
+          </w:p>
+        </w:tc>
+        <w:tc>
+          <w:tcPr>
+            <w:tcW w:type="dxa" w:w="1296"/>
+            <w:vAlign w:val="center"/>
+            <w:shd w:fill="F0F5F8"/>
+            <w:tcMar>
+              <w:top w:w="65" w:type="dxa"/>
+              <w:bottom w:w="65" w:type="dxa"/>
+              <w:left w:w="65" w:type="dxa"/>
+              <w:right w:w="65" w:type="dxa"/>
+            </w:tcMar>
+          </w:tcPr>
+          <w:p>
+            <w:pPr>
+              <w:keepNext w:val="0"/>
+              <w:spacing w:after="20" w:before="20" w:line="245" w:lineRule="auto"/>
+            </w:pPr>
+            <w:r>
+              <w:rPr>
+                <w:b w:val="0"/>
+                <w:sz w:val="17"/>
+              </w:rPr>
+              <w:t>0.010</w:t>
+            </w:r>
+          </w:p>
+        </w:tc>
+        <w:tc>
+          <w:tcPr>
+            <w:tcW w:type="dxa" w:w="1296"/>
+            <w:vAlign w:val="center"/>
+            <w:shd w:fill="F0F5F8"/>
+            <w:tcMar>
+              <w:top w:w="65" w:type="dxa"/>
+              <w:bottom w:w="65" w:type="dxa"/>
+              <w:left w:w="65" w:type="dxa"/>
+              <w:right w:w="65" w:type="dxa"/>
+            </w:tcMar>
+          </w:tcPr>
+          <w:p>
+            <w:pPr>
+              <w:keepNext w:val="0"/>
+              <w:spacing w:after="20" w:before="20" w:line="245" w:lineRule="auto"/>
+            </w:pPr>
+            <w:r>
+              <w:rPr>
+                <w:b w:val="0"/>
+                <w:sz w:val="17"/>
+              </w:rPr>
+              <w:t>0.978</w:t>
+            </w:r>
+          </w:p>
+        </w:tc>
+      </w:tr>
+    </w:tbl>
+    <w:p>
+      <w:pPr>
+        <w:spacing w:after="0"/>
+      </w:pPr>
+    </w:p>
+    <w:p>
+      <w:r>
+        <w:rPr>
+          <w:b w:val="0"/>
+          <w:sz w:val="18"/>
+        </w:rPr>
+        <w:t>CITL = calibration-in-the-large. Values reproduce the saved outputs; no new model fits were performed for this check.</w:t>
+      </w:r>
+    </w:p>
+    <w:p>
+      <w:r>
+        <w:rPr>
+          <w:b w:val="0"/>
+        </w:rPr>
+      </w:r>
+      <w:r>
+        <w:rPr>
+          <w:b/>
+        </w:rPr>
+        <w:t>Preprocessing qualification:</w:t>
+      </w:r>
+      <w:r>
+        <w:rPr>
+          <w:b w:val="0"/>
+        </w:rPr>
+        <w:t xml:space="preserve"> the script learns imputation from the full outer-training set before dividing it into inner folds. Inner-fold scaling is local, and the outer held-out households remain protected, but imputation is not fitted separately inside each inner training split. For a reusable nested pipeline, learn and apply imputation inside each inner split, then learn it again from the full outer-training set for the final outer fit. The check below establishes the effect on the current predictors.</w:t>
+      </w:r>
+    </w:p>
+    <w:p>
+      <w:r>
+        <w:rPr>
+          <w:b w:val="0"/>
+        </w:rPr>
+      </w:r>
+      <w:r>
+        <w:rPr>
+          <w:b/>
+        </w:rPr>
+        <w:t>Dataset-specific check:</w:t>
+      </w:r>
+      <w:r>
+        <w:rPr>
+          <w:b w:val="0"/>
+        </w:rPr>
+        <w:t xml:space="preserve"> a read-only comparison across all 25 distinct inner partitions, both codings and 100 training/test design matrices found zero differences between the outer-imputed and strictly inner-imputed predictors. Schooling and office-access modes were identical. Consequently no numerical difference was observed for this dataset; this audit did not refit the models. The code change remains appropriate for general reuse.</w:t>
+      </w:r>
+    </w:p>
+    <w:p>
+      <w:r>
+        <w:rPr>
+          <w:b w:val="0"/>
+        </w:rPr>
+        <w:t>The ordinary merged model remains the reference. The comparison remains exploratory and conditional on the outcome-informed D-052 coding decision; it does not establish that merging improves performance in new populations.</w:t>
+      </w:r>
+    </w:p>
+    <w:p>
+      <w:pPr>
+        <w:pStyle w:val="Heading3"/>
+      </w:pPr>
+      <w:r>
+        <w:rPr>
+          <w:b w:val="0"/>
+        </w:rPr>
+        <w:t>Supplement S3: repeated household-grouped refitting</w:t>
+      </w:r>
+    </w:p>
+    <w:p>
+      <w:r>
+        <w:rPr>
+          <w:b w:val="0"/>
+        </w:rPr>
+        <w:t xml:space="preserve">The saved files contain the 20 seeds </w:t>
+      </w:r>
+      <w:r>
+        <w:rPr>
+          <w:b/>
+        </w:rPr>
+        <w:t>201415–201434</w:t>
+      </w:r>
+      <w:r>
+        <w:rPr>
+          <w:b w:val="0"/>
+        </w:rPr>
+        <w:t xml:space="preserve">, with five training-fold records per seed and </w:t>
+      </w:r>
+      <w:r>
+        <w:rPr>
+          <w:b/>
+        </w:rPr>
+        <w:t>100/100 recorded converged fits</w:t>
+      </w:r>
+      <w:r>
+        <w:rPr>
+          <w:b w:val="0"/>
+        </w:rPr>
+        <w:t>. The script gives each adult one held-out prediction within each repetition and calculates that repetition’s pooled metrics before summarising across repetitions.</w:t>
+      </w:r>
+    </w:p>
+    <w:tbl>
+      <w:tblPr>
+        <w:tblW w:type="auto" w:w="0"/>
+        <w:jc w:val="center"/>
+        <w:tblLayout w:type="fixed"/>
+        <w:tblLook w:firstColumn="1" w:firstRow="1" w:lastColumn="0" w:lastRow="0" w:noHBand="0" w:noVBand="1" w:val="04A0"/>
+      </w:tblPr>
+      <w:tblGrid>
+        <w:gridCol w:w="3254"/>
+        <w:gridCol w:w="1440"/>
+        <w:gridCol w:w="2592"/>
+        <w:gridCol w:w="2592"/>
+      </w:tblGrid>
+      <w:tr>
+        <w:trPr>
+          <w:cantSplit/>
+          <w:tblHeader/>
+        </w:trPr>
+        <w:tc>
+          <w:tcPr>
+            <w:tcW w:type="dxa" w:w="3254"/>
+            <w:vAlign w:val="center"/>
+            <w:shd w:fill="244D68"/>
+            <w:tcMar>
+              <w:top w:w="65" w:type="dxa"/>
+              <w:bottom w:w="65" w:type="dxa"/>
+              <w:left w:w="65" w:type="dxa"/>
+              <w:right w:w="65" w:type="dxa"/>
+            </w:tcMar>
+          </w:tcPr>
+          <w:p>
+            <w:pPr>
+              <w:keepNext w:val="0"/>
+              <w:spacing w:after="20" w:before="20" w:line="245" w:lineRule="auto"/>
+            </w:pPr>
+            <w:r>
+              <w:rPr>
+                <w:b/>
+                <w:color w:val="FFFFFF"/>
+                <w:sz w:val="18"/>
+              </w:rPr>
+              <w:t>Measure</w:t>
+            </w:r>
+          </w:p>
+        </w:tc>
+        <w:tc>
+          <w:tcPr>
+            <w:tcW w:type="dxa" w:w="1440"/>
+            <w:vAlign w:val="center"/>
+            <w:shd w:fill="244D68"/>
+            <w:tcMar>
+              <w:top w:w="65" w:type="dxa"/>
+              <w:bottom w:w="65" w:type="dxa"/>
+              <w:left w:w="65" w:type="dxa"/>
+              <w:right w:w="65" w:type="dxa"/>
+            </w:tcMar>
+          </w:tcPr>
+          <w:p>
+            <w:pPr>
+              <w:keepNext w:val="0"/>
+              <w:spacing w:after="20" w:before="20" w:line="245" w:lineRule="auto"/>
+            </w:pPr>
+            <w:r>
+              <w:rPr>
+                <w:b/>
+                <w:color w:val="FFFFFF"/>
+                <w:sz w:val="18"/>
+              </w:rPr>
+              <w:t>Median</w:t>
+            </w:r>
+          </w:p>
+        </w:tc>
+        <w:tc>
+          <w:tcPr>
+            <w:tcW w:type="dxa" w:w="2592"/>
+            <w:vAlign w:val="center"/>
+            <w:shd w:fill="244D68"/>
+            <w:tcMar>
+              <w:top w:w="65" w:type="dxa"/>
+              <w:bottom w:w="65" w:type="dxa"/>
+              <w:left w:w="65" w:type="dxa"/>
+              <w:right w:w="65" w:type="dxa"/>
+            </w:tcMar>
+          </w:tcPr>
+          <w:p>
+            <w:pPr>
+              <w:keepNext w:val="0"/>
+              <w:spacing w:after="20" w:before="20" w:line="245" w:lineRule="auto"/>
+            </w:pPr>
+            <w:r>
+              <w:rPr>
+                <w:b/>
+                <w:color w:val="FFFFFF"/>
+                <w:sz w:val="18"/>
+              </w:rPr>
+              <w:t>Interquartile range</w:t>
+            </w:r>
+          </w:p>
+        </w:tc>
+        <w:tc>
+          <w:tcPr>
+            <w:tcW w:type="dxa" w:w="2592"/>
+            <w:vAlign w:val="center"/>
+            <w:shd w:fill="244D68"/>
+            <w:tcMar>
+              <w:top w:w="65" w:type="dxa"/>
+              <w:bottom w:w="65" w:type="dxa"/>
+              <w:left w:w="65" w:type="dxa"/>
+              <w:right w:w="65" w:type="dxa"/>
+            </w:tcMar>
+          </w:tcPr>
+          <w:p>
+            <w:pPr>
+              <w:keepNext w:val="0"/>
+              <w:spacing w:after="20" w:before="20" w:line="245" w:lineRule="auto"/>
+            </w:pPr>
+            <w:r>
+              <w:rPr>
+                <w:b/>
+                <w:color w:val="FFFFFF"/>
+                <w:sz w:val="18"/>
+              </w:rPr>
+              <w:t>Range</w:t>
+            </w:r>
+          </w:p>
+        </w:tc>
+      </w:tr>
+      <w:tr>
+        <w:trPr>
+          <w:cantSplit/>
+        </w:trPr>
+        <w:tc>
+          <w:tcPr>
+            <w:tcW w:type="dxa" w:w="3254"/>
+            <w:vAlign w:val="center"/>
+            <w:shd w:fill="F0F5F8"/>
+            <w:tcMar>
+              <w:top w:w="65" w:type="dxa"/>
+              <w:bottom w:w="65" w:type="dxa"/>
+              <w:left w:w="65" w:type="dxa"/>
+              <w:right w:w="65" w:type="dxa"/>
+            </w:tcMar>
+          </w:tcPr>
+          <w:p>
+            <w:pPr>
+              <w:keepNext w:val="0"/>
+              <w:spacing w:after="20" w:before="20" w:line="245" w:lineRule="auto"/>
+            </w:pPr>
+            <w:r>
+              <w:rPr>
+                <w:b w:val="0"/>
+                <w:sz w:val="18"/>
+              </w:rPr>
+              <w:t>AUC</w:t>
+            </w:r>
+          </w:p>
+        </w:tc>
+        <w:tc>
+          <w:tcPr>
+            <w:tcW w:type="dxa" w:w="1440"/>
+            <w:vAlign w:val="center"/>
+            <w:shd w:fill="F0F5F8"/>
+            <w:tcMar>
+              <w:top w:w="65" w:type="dxa"/>
+              <w:bottom w:w="65" w:type="dxa"/>
+              <w:left w:w="65" w:type="dxa"/>
+              <w:right w:w="65" w:type="dxa"/>
+            </w:tcMar>
+          </w:tcPr>
+          <w:p>
+            <w:pPr>
+              <w:keepNext w:val="0"/>
+              <w:spacing w:after="20" w:before="20" w:line="245" w:lineRule="auto"/>
+            </w:pPr>
+            <w:r>
+              <w:rPr>
+                <w:b w:val="0"/>
+                <w:sz w:val="18"/>
+              </w:rPr>
+              <w:t>0.753</w:t>
+            </w:r>
+          </w:p>
+        </w:tc>
+        <w:tc>
+          <w:tcPr>
+            <w:tcW w:type="dxa" w:w="2592"/>
+            <w:vAlign w:val="center"/>
+            <w:shd w:fill="F0F5F8"/>
+            <w:tcMar>
+              <w:top w:w="65" w:type="dxa"/>
+              <w:bottom w:w="65" w:type="dxa"/>
+              <w:left w:w="65" w:type="dxa"/>
+              <w:right w:w="65" w:type="dxa"/>
+            </w:tcMar>
+          </w:tcPr>
+          <w:p>
+            <w:pPr>
+              <w:keepNext w:val="0"/>
+              <w:spacing w:after="20" w:before="20" w:line="245" w:lineRule="auto"/>
+            </w:pPr>
+            <w:r>
+              <w:rPr>
+                <w:b w:val="0"/>
+                <w:sz w:val="18"/>
+              </w:rPr>
+              <w:t>0.748–0.757</w:t>
+            </w:r>
+          </w:p>
+        </w:tc>
+        <w:tc>
+          <w:tcPr>
+            <w:tcW w:type="dxa" w:w="2592"/>
+            <w:vAlign w:val="center"/>
+            <w:shd w:fill="F0F5F8"/>
+            <w:tcMar>
+              <w:top w:w="65" w:type="dxa"/>
+              <w:bottom w:w="65" w:type="dxa"/>
+              <w:left w:w="65" w:type="dxa"/>
+              <w:right w:w="65" w:type="dxa"/>
+            </w:tcMar>
+          </w:tcPr>
+          <w:p>
+            <w:pPr>
+              <w:keepNext w:val="0"/>
+              <w:spacing w:after="20" w:before="20" w:line="245" w:lineRule="auto"/>
+            </w:pPr>
+            <w:r>
+              <w:rPr>
+                <w:b w:val="0"/>
+                <w:sz w:val="18"/>
+              </w:rPr>
+              <w:t>0.733–0.773</w:t>
+            </w:r>
+          </w:p>
+        </w:tc>
+      </w:tr>
+      <w:tr>
+        <w:trPr>
+          <w:cantSplit/>
+        </w:trPr>
+        <w:tc>
+          <w:tcPr>
+            <w:tcW w:type="dxa" w:w="3254"/>
+            <w:vAlign w:val="center"/>
+            <w:shd w:fill="FFFFFF"/>
+            <w:tcMar>
+              <w:top w:w="65" w:type="dxa"/>
+              <w:bottom w:w="65" w:type="dxa"/>
+              <w:left w:w="65" w:type="dxa"/>
+              <w:right w:w="65" w:type="dxa"/>
+            </w:tcMar>
+          </w:tcPr>
+          <w:p>
+            <w:pPr>
+              <w:keepNext w:val="0"/>
+              <w:spacing w:after="20" w:before="20" w:line="245" w:lineRule="auto"/>
+            </w:pPr>
+            <w:r>
+              <w:rPr>
+                <w:b w:val="0"/>
+                <w:sz w:val="18"/>
+              </w:rPr>
+              <w:t>Average precision</w:t>
+            </w:r>
+          </w:p>
+        </w:tc>
+        <w:tc>
+          <w:tcPr>
+            <w:tcW w:type="dxa" w:w="1440"/>
+            <w:vAlign w:val="center"/>
+            <w:shd w:fill="FFFFFF"/>
+            <w:tcMar>
+              <w:top w:w="65" w:type="dxa"/>
+              <w:bottom w:w="65" w:type="dxa"/>
+              <w:left w:w="65" w:type="dxa"/>
+              <w:right w:w="65" w:type="dxa"/>
+            </w:tcMar>
+          </w:tcPr>
+          <w:p>
+            <w:pPr>
+              <w:keepNext w:val="0"/>
+              <w:spacing w:after="20" w:before="20" w:line="245" w:lineRule="auto"/>
+            </w:pPr>
+            <w:r>
+              <w:rPr>
+                <w:b w:val="0"/>
+                <w:sz w:val="18"/>
+              </w:rPr>
+              <w:t>0.208</w:t>
+            </w:r>
+          </w:p>
+        </w:tc>
+        <w:tc>
+          <w:tcPr>
+            <w:tcW w:type="dxa" w:w="2592"/>
+            <w:vAlign w:val="center"/>
+            <w:shd w:fill="FFFFFF"/>
+            <w:tcMar>
+              <w:top w:w="65" w:type="dxa"/>
+              <w:bottom w:w="65" w:type="dxa"/>
+              <w:left w:w="65" w:type="dxa"/>
+              <w:right w:w="65" w:type="dxa"/>
+            </w:tcMar>
+          </w:tcPr>
+          <w:p>
+            <w:pPr>
+              <w:keepNext w:val="0"/>
+              <w:spacing w:after="20" w:before="20" w:line="245" w:lineRule="auto"/>
+            </w:pPr>
+            <w:r>
+              <w:rPr>
+                <w:b w:val="0"/>
+                <w:sz w:val="18"/>
+              </w:rPr>
+              <w:t>0.199–0.227</w:t>
+            </w:r>
+          </w:p>
+        </w:tc>
+        <w:tc>
+          <w:tcPr>
+            <w:tcW w:type="dxa" w:w="2592"/>
+            <w:vAlign w:val="center"/>
+            <w:shd w:fill="FFFFFF"/>
+            <w:tcMar>
+              <w:top w:w="65" w:type="dxa"/>
+              <w:bottom w:w="65" w:type="dxa"/>
+              <w:left w:w="65" w:type="dxa"/>
+              <w:right w:w="65" w:type="dxa"/>
+            </w:tcMar>
+          </w:tcPr>
+          <w:p>
+            <w:pPr>
+              <w:keepNext w:val="0"/>
+              <w:spacing w:after="20" w:before="20" w:line="245" w:lineRule="auto"/>
+            </w:pPr>
+            <w:r>
+              <w:rPr>
+                <w:b w:val="0"/>
+                <w:sz w:val="18"/>
+              </w:rPr>
+              <w:t>0.173–0.246</w:t>
+            </w:r>
+          </w:p>
+        </w:tc>
+      </w:tr>
+      <w:tr>
+        <w:trPr>
+          <w:cantSplit/>
+        </w:trPr>
+        <w:tc>
+          <w:tcPr>
+            <w:tcW w:type="dxa" w:w="3254"/>
+            <w:vAlign w:val="center"/>
+            <w:shd w:fill="F0F5F8"/>
+            <w:tcMar>
+              <w:top w:w="65" w:type="dxa"/>
+              <w:bottom w:w="65" w:type="dxa"/>
+              <w:left w:w="65" w:type="dxa"/>
+              <w:right w:w="65" w:type="dxa"/>
+            </w:tcMar>
+          </w:tcPr>
+          <w:p>
+            <w:pPr>
+              <w:keepNext w:val="0"/>
+              <w:spacing w:after="20" w:before="20" w:line="245" w:lineRule="auto"/>
+            </w:pPr>
+            <w:r>
+              <w:rPr>
+                <w:b w:val="0"/>
+                <w:sz w:val="18"/>
+              </w:rPr>
+              <w:t>Brier</w:t>
+            </w:r>
+          </w:p>
+        </w:tc>
+        <w:tc>
+          <w:tcPr>
+            <w:tcW w:type="dxa" w:w="1440"/>
+            <w:vAlign w:val="center"/>
+            <w:shd w:fill="F0F5F8"/>
+            <w:tcMar>
+              <w:top w:w="65" w:type="dxa"/>
+              <w:bottom w:w="65" w:type="dxa"/>
+              <w:left w:w="65" w:type="dxa"/>
+              <w:right w:w="65" w:type="dxa"/>
+            </w:tcMar>
+          </w:tcPr>
+          <w:p>
+            <w:pPr>
+              <w:keepNext w:val="0"/>
+              <w:spacing w:after="20" w:before="20" w:line="245" w:lineRule="auto"/>
+            </w:pPr>
+            <w:r>
+              <w:rPr>
+                <w:b w:val="0"/>
+                <w:sz w:val="18"/>
+              </w:rPr>
+              <w:t>0.0578</w:t>
+            </w:r>
+          </w:p>
+        </w:tc>
+        <w:tc>
+          <w:tcPr>
+            <w:tcW w:type="dxa" w:w="2592"/>
+            <w:vAlign w:val="center"/>
+            <w:shd w:fill="F0F5F8"/>
+            <w:tcMar>
+              <w:top w:w="65" w:type="dxa"/>
+              <w:bottom w:w="65" w:type="dxa"/>
+              <w:left w:w="65" w:type="dxa"/>
+              <w:right w:w="65" w:type="dxa"/>
+            </w:tcMar>
+          </w:tcPr>
+          <w:p>
+            <w:pPr>
+              <w:keepNext w:val="0"/>
+              <w:spacing w:after="20" w:before="20" w:line="245" w:lineRule="auto"/>
+            </w:pPr>
+            <w:r>
+              <w:rPr>
+                <w:b w:val="0"/>
+                <w:sz w:val="18"/>
+              </w:rPr>
+              <w:t>0.0571–0.0580</w:t>
+            </w:r>
+          </w:p>
+        </w:tc>
+        <w:tc>
+          <w:tcPr>
+            <w:tcW w:type="dxa" w:w="2592"/>
+            <w:vAlign w:val="center"/>
+            <w:shd w:fill="F0F5F8"/>
+            <w:tcMar>
+              <w:top w:w="65" w:type="dxa"/>
+              <w:bottom w:w="65" w:type="dxa"/>
+              <w:left w:w="65" w:type="dxa"/>
+              <w:right w:w="65" w:type="dxa"/>
+            </w:tcMar>
+          </w:tcPr>
+          <w:p>
+            <w:pPr>
+              <w:keepNext w:val="0"/>
+              <w:spacing w:after="20" w:before="20" w:line="245" w:lineRule="auto"/>
+            </w:pPr>
+            <w:r>
+              <w:rPr>
+                <w:b w:val="0"/>
+                <w:sz w:val="18"/>
+              </w:rPr>
+              <w:t>0.0565–0.0588</w:t>
+            </w:r>
+          </w:p>
+        </w:tc>
+      </w:tr>
+      <w:tr>
+        <w:trPr>
+          <w:cantSplit/>
+        </w:trPr>
+        <w:tc>
+          <w:tcPr>
+            <w:tcW w:type="dxa" w:w="3254"/>
+            <w:vAlign w:val="center"/>
+            <w:shd w:fill="FFFFFF"/>
+            <w:tcMar>
+              <w:top w:w="65" w:type="dxa"/>
+              <w:bottom w:w="65" w:type="dxa"/>
+              <w:left w:w="65" w:type="dxa"/>
+              <w:right w:w="65" w:type="dxa"/>
+            </w:tcMar>
+          </w:tcPr>
+          <w:p>
+            <w:pPr>
+              <w:keepNext w:val="0"/>
+              <w:spacing w:after="20" w:before="20" w:line="245" w:lineRule="auto"/>
+            </w:pPr>
+            <w:r>
+              <w:rPr>
+                <w:b w:val="0"/>
+                <w:sz w:val="18"/>
+              </w:rPr>
+              <w:t>Calibration-in-the-large</w:t>
+            </w:r>
+          </w:p>
+        </w:tc>
+        <w:tc>
+          <w:tcPr>
+            <w:tcW w:type="dxa" w:w="1440"/>
+            <w:vAlign w:val="center"/>
+            <w:shd w:fill="FFFFFF"/>
+            <w:tcMar>
+              <w:top w:w="65" w:type="dxa"/>
+              <w:bottom w:w="65" w:type="dxa"/>
+              <w:left w:w="65" w:type="dxa"/>
+              <w:right w:w="65" w:type="dxa"/>
+            </w:tcMar>
+          </w:tcPr>
+          <w:p>
+            <w:pPr>
+              <w:keepNext w:val="0"/>
+              <w:spacing w:after="20" w:before="20" w:line="245" w:lineRule="auto"/>
+            </w:pPr>
+            <w:r>
+              <w:rPr>
+                <w:b w:val="0"/>
+                <w:sz w:val="18"/>
+              </w:rPr>
+              <w:t>0.004</w:t>
+            </w:r>
+          </w:p>
+        </w:tc>
+        <w:tc>
+          <w:tcPr>
+            <w:tcW w:type="dxa" w:w="2592"/>
+            <w:vAlign w:val="center"/>
+            <w:shd w:fill="FFFFFF"/>
+            <w:tcMar>
+              <w:top w:w="65" w:type="dxa"/>
+              <w:bottom w:w="65" w:type="dxa"/>
+              <w:left w:w="65" w:type="dxa"/>
+              <w:right w:w="65" w:type="dxa"/>
+            </w:tcMar>
+          </w:tcPr>
+          <w:p>
+            <w:pPr>
+              <w:keepNext w:val="0"/>
+              <w:spacing w:after="20" w:before="20" w:line="245" w:lineRule="auto"/>
+            </w:pPr>
+            <w:r>
+              <w:rPr>
+                <w:b w:val="0"/>
+                <w:sz w:val="18"/>
+              </w:rPr>
+              <w:t>-0.002–0.012</w:t>
+            </w:r>
+          </w:p>
+        </w:tc>
+        <w:tc>
+          <w:tcPr>
+            <w:tcW w:type="dxa" w:w="2592"/>
+            <w:vAlign w:val="center"/>
+            <w:shd w:fill="FFFFFF"/>
+            <w:tcMar>
+              <w:top w:w="65" w:type="dxa"/>
+              <w:bottom w:w="65" w:type="dxa"/>
+              <w:left w:w="65" w:type="dxa"/>
+              <w:right w:w="65" w:type="dxa"/>
+            </w:tcMar>
+          </w:tcPr>
+          <w:p>
+            <w:pPr>
+              <w:keepNext w:val="0"/>
+              <w:spacing w:after="20" w:before="20" w:line="245" w:lineRule="auto"/>
+            </w:pPr>
+            <w:r>
+              <w:rPr>
+                <w:b w:val="0"/>
+                <w:sz w:val="18"/>
+              </w:rPr>
+              <w:t>-0.014–0.020</w:t>
+            </w:r>
+          </w:p>
+        </w:tc>
+      </w:tr>
+      <w:tr>
+        <w:trPr>
+          <w:cantSplit/>
+        </w:trPr>
+        <w:tc>
+          <w:tcPr>
+            <w:tcW w:type="dxa" w:w="3254"/>
+            <w:vAlign w:val="center"/>
+            <w:shd w:fill="F0F5F8"/>
+            <w:tcMar>
+              <w:top w:w="65" w:type="dxa"/>
+              <w:bottom w:w="65" w:type="dxa"/>
+              <w:left w:w="65" w:type="dxa"/>
+              <w:right w:w="65" w:type="dxa"/>
+            </w:tcMar>
+          </w:tcPr>
+          <w:p>
+            <w:pPr>
+              <w:keepNext w:val="0"/>
+              <w:spacing w:after="20" w:before="20" w:line="245" w:lineRule="auto"/>
+            </w:pPr>
+            <w:r>
+              <w:rPr>
+                <w:b w:val="0"/>
+                <w:sz w:val="18"/>
+              </w:rPr>
+              <w:t>Calibration slope</w:t>
+            </w:r>
+          </w:p>
+        </w:tc>
+        <w:tc>
+          <w:tcPr>
+            <w:tcW w:type="dxa" w:w="1440"/>
+            <w:vAlign w:val="center"/>
+            <w:shd w:fill="F0F5F8"/>
+            <w:tcMar>
+              <w:top w:w="65" w:type="dxa"/>
+              <w:bottom w:w="65" w:type="dxa"/>
+              <w:left w:w="65" w:type="dxa"/>
+              <w:right w:w="65" w:type="dxa"/>
+            </w:tcMar>
+          </w:tcPr>
+          <w:p>
+            <w:pPr>
+              <w:keepNext w:val="0"/>
+              <w:spacing w:after="20" w:before="20" w:line="245" w:lineRule="auto"/>
+            </w:pPr>
+            <w:r>
+              <w:rPr>
+                <w:b w:val="0"/>
+                <w:sz w:val="18"/>
+              </w:rPr>
+              <w:t>0.837</w:t>
+            </w:r>
+          </w:p>
+        </w:tc>
+        <w:tc>
+          <w:tcPr>
+            <w:tcW w:type="dxa" w:w="2592"/>
+            <w:vAlign w:val="center"/>
+            <w:shd w:fill="F0F5F8"/>
+            <w:tcMar>
+              <w:top w:w="65" w:type="dxa"/>
+              <w:bottom w:w="65" w:type="dxa"/>
+              <w:left w:w="65" w:type="dxa"/>
+              <w:right w:w="65" w:type="dxa"/>
+            </w:tcMar>
+          </w:tcPr>
+          <w:p>
+            <w:pPr>
+              <w:keepNext w:val="0"/>
+              <w:spacing w:after="20" w:before="20" w:line="245" w:lineRule="auto"/>
+            </w:pPr>
+            <w:r>
+              <w:rPr>
+                <w:b w:val="0"/>
+                <w:sz w:val="18"/>
+              </w:rPr>
+              <w:t>0.812–0.865</w:t>
+            </w:r>
+          </w:p>
+        </w:tc>
+        <w:tc>
+          <w:tcPr>
+            <w:tcW w:type="dxa" w:w="2592"/>
+            <w:vAlign w:val="center"/>
+            <w:shd w:fill="F0F5F8"/>
+            <w:tcMar>
+              <w:top w:w="65" w:type="dxa"/>
+              <w:bottom w:w="65" w:type="dxa"/>
+              <w:left w:w="65" w:type="dxa"/>
+              <w:right w:w="65" w:type="dxa"/>
+            </w:tcMar>
+          </w:tcPr>
+          <w:p>
+            <w:pPr>
+              <w:keepNext w:val="0"/>
+              <w:spacing w:after="20" w:before="20" w:line="245" w:lineRule="auto"/>
+            </w:pPr>
+            <w:r>
+              <w:rPr>
+                <w:b w:val="0"/>
+                <w:sz w:val="18"/>
+              </w:rPr>
+              <w:t>0.738–0.943</w:t>
+            </w:r>
+          </w:p>
+        </w:tc>
+      </w:tr>
+    </w:tbl>
+    <w:p>
+      <w:pPr>
+        <w:spacing w:after="0"/>
+      </w:pPr>
+    </w:p>
+    <w:p>
+      <w:r>
+        <w:rPr>
+          <w:b w:val="0"/>
+        </w:rPr>
+        <w:t>The five metric summaries and six coefficient summaries were recalculated from the detailed CSVs. Female and below-Grade-7 coefficients were negative in 100/100 fits; urban-informal coefficients were negative in 27/100. These are overlapping-fit stability descriptions, not significance tests. The spread across repetitions is not a 95% confidence interval and does not include uncertainty from choosing D-052.</w:t>
+      </w:r>
+    </w:p>
+    <w:p>
+      <w:r>
+        <w:rPr>
+          <w:b w:val="0"/>
+        </w:rPr>
+      </w:r>
+      <w:r>
+        <w:rPr>
+          <w:b/>
+        </w:rPr>
+        <w:t>Traceability records:</w:t>
+      </w:r>
+      <w:r>
+        <w:rPr>
+          <w:b w:val="0"/>
+        </w:rPr>
+        <w:t xml:space="preserve"> output/phase5_ridge_settlement/{metrics.csv, fold_penalties.csv, run_record.json}; output/phase5_refit_repeats/{repetition_metrics.csv, fold_coefficients.csv, summary.csv, coefficient_summary.csv, run_record.json}. Keep any future individual prediction and household-linkage records controlled; publish appropriate aggregate evidence.</w:t>
+      </w:r>
+    </w:p>
+    <w:p>
+      <w:r>
+        <w:br w:type="page"/>
+      </w:r>
+    </w:p>
+    <w:p>
+      <w:pPr>
+        <w:pStyle w:val="Heading1"/>
+      </w:pPr>
+      <w:r>
+        <w:rPr>
+          <w:b w:val="0"/>
+        </w:rPr>
+        <w:t>Missing item 1 — Search evidence and closure actions</w:t>
+      </w:r>
+    </w:p>
+    <w:p>
+      <w:pPr>
+        <w:pStyle w:val="Heading3"/>
+      </w:pPr>
+      <w:r>
+        <w:rPr>
+          <w:b w:val="0"/>
+        </w:rPr>
+        <w:t>Supplement S5: recoverable recorded search details</w:t>
+      </w:r>
+    </w:p>
+    <w:p>
+      <w:r>
+        <w:rPr>
+          <w:b w:val="0"/>
+        </w:rPr>
+        <w:t xml:space="preserve">An earlier repository revision, </w:t>
+      </w:r>
+      <w:r>
+        <w:rPr>
+          <w:b/>
+        </w:rPr>
+        <w:t>e0b29b9b</w:t>
+      </w:r>
+      <w:r>
+        <w:rPr>
+          <w:b w:val="0"/>
+        </w:rPr>
+        <w:t xml:space="preserve">, preserves eight exact query strings and the recorded date </w:t>
+      </w:r>
+      <w:r>
+        <w:rPr>
+          <w:b/>
+        </w:rPr>
+        <w:t>17 August 2026</w:t>
+      </w:r>
+      <w:r>
+        <w:rPr>
+          <w:b w:val="0"/>
+        </w:rPr>
+        <w:t>. The following totals can be recovered from that author record. These search IDs are separate from the screening-scenario IDs used in S1.</w:t>
+      </w:r>
+    </w:p>
+    <w:tbl>
+      <w:tblPr>
+        <w:tblW w:type="auto" w:w="0"/>
+        <w:jc w:val="center"/>
+        <w:tblLayout w:type="fixed"/>
+        <w:tblLook w:firstColumn="1" w:firstRow="1" w:lastColumn="0" w:lastRow="0" w:noHBand="0" w:noVBand="1" w:val="04A0"/>
+      </w:tblPr>
+      <w:tblGrid>
+        <w:gridCol w:w="1224"/>
+        <w:gridCol w:w="4622"/>
+        <w:gridCol w:w="2016"/>
+        <w:gridCol w:w="2016"/>
+      </w:tblGrid>
+      <w:tr>
+        <w:trPr>
+          <w:cantSplit/>
+          <w:tblHeader/>
+        </w:trPr>
+        <w:tc>
+          <w:tcPr>
+            <w:tcW w:type="dxa" w:w="1224"/>
+            <w:vAlign w:val="center"/>
+            <w:shd w:fill="244D68"/>
+            <w:tcMar>
+              <w:top w:w="65" w:type="dxa"/>
+              <w:bottom w:w="65" w:type="dxa"/>
+              <w:left w:w="65" w:type="dxa"/>
+              <w:right w:w="65" w:type="dxa"/>
+            </w:tcMar>
+          </w:tcPr>
+          <w:p>
+            <w:pPr>
+              <w:keepNext w:val="0"/>
+              <w:spacing w:after="20" w:before="20" w:line="245" w:lineRule="auto"/>
+            </w:pPr>
+            <w:r>
+              <w:rPr>
+                <w:b/>
+                <w:color w:val="FFFFFF"/>
+                <w:sz w:val="18"/>
+              </w:rPr>
+              <w:t>Search ID</w:t>
+            </w:r>
+          </w:p>
+        </w:tc>
+        <w:tc>
+          <w:tcPr>
+            <w:tcW w:type="dxa" w:w="4622"/>
+            <w:vAlign w:val="center"/>
+            <w:shd w:fill="244D68"/>
+            <w:tcMar>
+              <w:top w:w="65" w:type="dxa"/>
+              <w:bottom w:w="65" w:type="dxa"/>
+              <w:left w:w="65" w:type="dxa"/>
+              <w:right w:w="65" w:type="dxa"/>
+            </w:tcMar>
+          </w:tcPr>
+          <w:p>
+            <w:pPr>
+              <w:keepNext w:val="0"/>
+              <w:spacing w:after="20" w:before="20" w:line="245" w:lineRule="auto"/>
+            </w:pPr>
+            <w:r>
+              <w:rPr>
+                <w:b/>
+                <w:color w:val="FFFFFF"/>
+                <w:sz w:val="18"/>
+              </w:rPr>
+              <w:t>Recorded platform</w:t>
+            </w:r>
+          </w:p>
+        </w:tc>
+        <w:tc>
+          <w:tcPr>
+            <w:tcW w:type="dxa" w:w="2016"/>
+            <w:vAlign w:val="center"/>
+            <w:shd w:fill="244D68"/>
+            <w:tcMar>
+              <w:top w:w="65" w:type="dxa"/>
+              <w:bottom w:w="65" w:type="dxa"/>
+              <w:left w:w="65" w:type="dxa"/>
+              <w:right w:w="65" w:type="dxa"/>
+            </w:tcMar>
+          </w:tcPr>
+          <w:p>
+            <w:pPr>
+              <w:keepNext w:val="0"/>
+              <w:spacing w:after="20" w:before="20" w:line="245" w:lineRule="auto"/>
+            </w:pPr>
+            <w:r>
+              <w:rPr>
+                <w:b/>
+                <w:color w:val="FFFFFF"/>
+                <w:sz w:val="18"/>
+              </w:rPr>
+              <w:t>Hits</w:t>
+            </w:r>
+          </w:p>
+        </w:tc>
+        <w:tc>
+          <w:tcPr>
+            <w:tcW w:type="dxa" w:w="2016"/>
+            <w:vAlign w:val="center"/>
+            <w:shd w:fill="244D68"/>
+            <w:tcMar>
+              <w:top w:w="65" w:type="dxa"/>
+              <w:bottom w:w="65" w:type="dxa"/>
+              <w:left w:w="65" w:type="dxa"/>
+              <w:right w:w="65" w:type="dxa"/>
+            </w:tcMar>
+          </w:tcPr>
+          <w:p>
+            <w:pPr>
+              <w:keepNext w:val="0"/>
+              <w:spacing w:after="20" w:before="20" w:line="245" w:lineRule="auto"/>
+            </w:pPr>
+            <w:r>
+              <w:rPr>
+                <w:b/>
+                <w:color w:val="FFFFFF"/>
+                <w:sz w:val="18"/>
+              </w:rPr>
+              <w:t>Retained</w:t>
+            </w:r>
+          </w:p>
+        </w:tc>
+      </w:tr>
+      <w:tr>
+        <w:trPr>
+          <w:cantSplit/>
+        </w:trPr>
+        <w:tc>
+          <w:tcPr>
+            <w:tcW w:type="dxa" w:w="1224"/>
+            <w:vAlign w:val="center"/>
+            <w:shd w:fill="F0F5F8"/>
+            <w:tcMar>
+              <w:top w:w="65" w:type="dxa"/>
+              <w:bottom w:w="65" w:type="dxa"/>
+              <w:left w:w="65" w:type="dxa"/>
+              <w:right w:w="65" w:type="dxa"/>
+            </w:tcMar>
+          </w:tcPr>
+          <w:p>
+            <w:pPr>
+              <w:keepNext w:val="0"/>
+              <w:spacing w:after="20" w:before="20" w:line="245" w:lineRule="auto"/>
+            </w:pPr>
+            <w:r>
+              <w:rPr>
+                <w:b w:val="0"/>
+                <w:sz w:val="18"/>
+              </w:rPr>
+              <w:t>S1</w:t>
+            </w:r>
+          </w:p>
+        </w:tc>
+        <w:tc>
+          <w:tcPr>
+            <w:tcW w:type="dxa" w:w="4622"/>
+            <w:vAlign w:val="center"/>
+            <w:shd w:fill="F0F5F8"/>
+            <w:tcMar>
+              <w:top w:w="65" w:type="dxa"/>
+              <w:bottom w:w="65" w:type="dxa"/>
+              <w:left w:w="65" w:type="dxa"/>
+              <w:right w:w="65" w:type="dxa"/>
+            </w:tcMar>
+          </w:tcPr>
+          <w:p>
+            <w:pPr>
+              <w:keepNext w:val="0"/>
+              <w:spacing w:after="20" w:before="20" w:line="245" w:lineRule="auto"/>
+            </w:pPr>
+            <w:r>
+              <w:rPr>
+                <w:b w:val="0"/>
+                <w:sz w:val="18"/>
+              </w:rPr>
+              <w:t>Scopus</w:t>
+            </w:r>
+          </w:p>
+        </w:tc>
+        <w:tc>
+          <w:tcPr>
+            <w:tcW w:type="dxa" w:w="2016"/>
+            <w:vAlign w:val="center"/>
+            <w:shd w:fill="F0F5F8"/>
+            <w:tcMar>
+              <w:top w:w="65" w:type="dxa"/>
+              <w:bottom w:w="65" w:type="dxa"/>
+              <w:left w:w="65" w:type="dxa"/>
+              <w:right w:w="65" w:type="dxa"/>
+            </w:tcMar>
+          </w:tcPr>
+          <w:p>
+            <w:pPr>
+              <w:keepNext w:val="0"/>
+              <w:spacing w:after="20" w:before="20" w:line="245" w:lineRule="auto"/>
+            </w:pPr>
+            <w:r>
+              <w:rPr>
+                <w:b w:val="0"/>
+                <w:sz w:val="18"/>
+              </w:rPr>
+              <w:t>43</w:t>
+            </w:r>
+          </w:p>
+        </w:tc>
+        <w:tc>
+          <w:tcPr>
+            <w:tcW w:type="dxa" w:w="2016"/>
+            <w:vAlign w:val="center"/>
+            <w:shd w:fill="F0F5F8"/>
+            <w:tcMar>
+              <w:top w:w="65" w:type="dxa"/>
+              <w:bottom w:w="65" w:type="dxa"/>
+              <w:left w:w="65" w:type="dxa"/>
+              <w:right w:w="65" w:type="dxa"/>
+            </w:tcMar>
+          </w:tcPr>
+          <w:p>
+            <w:pPr>
+              <w:keepNext w:val="0"/>
+              <w:spacing w:after="20" w:before="20" w:line="245" w:lineRule="auto"/>
+            </w:pPr>
+            <w:r>
+              <w:rPr>
+                <w:b w:val="0"/>
+                <w:sz w:val="18"/>
+              </w:rPr>
+              <w:t>9</w:t>
+            </w:r>
+          </w:p>
+        </w:tc>
+      </w:tr>
+      <w:tr>
+        <w:trPr>
+          <w:cantSplit/>
+        </w:trPr>
+        <w:tc>
+          <w:tcPr>
+            <w:tcW w:type="dxa" w:w="1224"/>
+            <w:vAlign w:val="center"/>
+            <w:shd w:fill="FFFFFF"/>
+            <w:tcMar>
+              <w:top w:w="65" w:type="dxa"/>
+              <w:bottom w:w="65" w:type="dxa"/>
+              <w:left w:w="65" w:type="dxa"/>
+              <w:right w:w="65" w:type="dxa"/>
+            </w:tcMar>
+          </w:tcPr>
+          <w:p>
+            <w:pPr>
+              <w:keepNext w:val="0"/>
+              <w:spacing w:after="20" w:before="20" w:line="245" w:lineRule="auto"/>
+            </w:pPr>
+            <w:r>
+              <w:rPr>
+                <w:b w:val="0"/>
+                <w:sz w:val="18"/>
+              </w:rPr>
+              <w:t>S1b</w:t>
+            </w:r>
+          </w:p>
+        </w:tc>
+        <w:tc>
+          <w:tcPr>
+            <w:tcW w:type="dxa" w:w="4622"/>
+            <w:vAlign w:val="center"/>
+            <w:shd w:fill="FFFFFF"/>
+            <w:tcMar>
+              <w:top w:w="65" w:type="dxa"/>
+              <w:bottom w:w="65" w:type="dxa"/>
+              <w:left w:w="65" w:type="dxa"/>
+              <w:right w:w="65" w:type="dxa"/>
+            </w:tcMar>
+          </w:tcPr>
+          <w:p>
+            <w:pPr>
+              <w:keepNext w:val="0"/>
+              <w:spacing w:after="20" w:before="20" w:line="245" w:lineRule="auto"/>
+            </w:pPr>
+            <w:r>
+              <w:rPr>
+                <w:b w:val="0"/>
+                <w:sz w:val="18"/>
+              </w:rPr>
+              <w:t>Scopus, widened</w:t>
+            </w:r>
+          </w:p>
+        </w:tc>
+        <w:tc>
+          <w:tcPr>
+            <w:tcW w:type="dxa" w:w="2016"/>
+            <w:vAlign w:val="center"/>
+            <w:shd w:fill="FFFFFF"/>
+            <w:tcMar>
+              <w:top w:w="65" w:type="dxa"/>
+              <w:bottom w:w="65" w:type="dxa"/>
+              <w:left w:w="65" w:type="dxa"/>
+              <w:right w:w="65" w:type="dxa"/>
+            </w:tcMar>
+          </w:tcPr>
+          <w:p>
+            <w:pPr>
+              <w:keepNext w:val="0"/>
+              <w:spacing w:after="20" w:before="20" w:line="245" w:lineRule="auto"/>
+            </w:pPr>
+            <w:r>
+              <w:rPr>
+                <w:b w:val="0"/>
+                <w:sz w:val="18"/>
+              </w:rPr>
+              <w:t>149</w:t>
+            </w:r>
+          </w:p>
+        </w:tc>
+        <w:tc>
+          <w:tcPr>
+            <w:tcW w:type="dxa" w:w="2016"/>
+            <w:vAlign w:val="center"/>
+            <w:shd w:fill="FFFFFF"/>
+            <w:tcMar>
+              <w:top w:w="65" w:type="dxa"/>
+              <w:bottom w:w="65" w:type="dxa"/>
+              <w:left w:w="65" w:type="dxa"/>
+              <w:right w:w="65" w:type="dxa"/>
+            </w:tcMar>
+          </w:tcPr>
+          <w:p>
+            <w:pPr>
+              <w:keepNext w:val="0"/>
+              <w:spacing w:after="20" w:before="20" w:line="245" w:lineRule="auto"/>
+            </w:pPr>
+            <w:r>
+              <w:rPr>
+                <w:b w:val="0"/>
+                <w:sz w:val="18"/>
+              </w:rPr>
+              <w:t>10</w:t>
+            </w:r>
+          </w:p>
+        </w:tc>
+      </w:tr>
+      <w:tr>
+        <w:trPr>
+          <w:cantSplit/>
+        </w:trPr>
+        <w:tc>
+          <w:tcPr>
+            <w:tcW w:type="dxa" w:w="1224"/>
+            <w:vAlign w:val="center"/>
+            <w:shd w:fill="F0F5F8"/>
+            <w:tcMar>
+              <w:top w:w="65" w:type="dxa"/>
+              <w:bottom w:w="65" w:type="dxa"/>
+              <w:left w:w="65" w:type="dxa"/>
+              <w:right w:w="65" w:type="dxa"/>
+            </w:tcMar>
+          </w:tcPr>
+          <w:p>
+            <w:pPr>
+              <w:keepNext w:val="0"/>
+              <w:spacing w:after="20" w:before="20" w:line="245" w:lineRule="auto"/>
+            </w:pPr>
+            <w:r>
+              <w:rPr>
+                <w:b w:val="0"/>
+                <w:sz w:val="18"/>
+              </w:rPr>
+              <w:t>S2</w:t>
+            </w:r>
+          </w:p>
+        </w:tc>
+        <w:tc>
+          <w:tcPr>
+            <w:tcW w:type="dxa" w:w="4622"/>
+            <w:vAlign w:val="center"/>
+            <w:shd w:fill="F0F5F8"/>
+            <w:tcMar>
+              <w:top w:w="65" w:type="dxa"/>
+              <w:bottom w:w="65" w:type="dxa"/>
+              <w:left w:w="65" w:type="dxa"/>
+              <w:right w:w="65" w:type="dxa"/>
+            </w:tcMar>
+          </w:tcPr>
+          <w:p>
+            <w:pPr>
+              <w:keepNext w:val="0"/>
+              <w:spacing w:after="20" w:before="20" w:line="245" w:lineRule="auto"/>
+            </w:pPr>
+            <w:r>
+              <w:rPr>
+                <w:b w:val="0"/>
+                <w:sz w:val="18"/>
+              </w:rPr>
+              <w:t>Scopus, method</w:t>
+            </w:r>
+          </w:p>
+        </w:tc>
+        <w:tc>
+          <w:tcPr>
+            <w:tcW w:type="dxa" w:w="2016"/>
+            <w:vAlign w:val="center"/>
+            <w:shd w:fill="F0F5F8"/>
+            <w:tcMar>
+              <w:top w:w="65" w:type="dxa"/>
+              <w:bottom w:w="65" w:type="dxa"/>
+              <w:left w:w="65" w:type="dxa"/>
+              <w:right w:w="65" w:type="dxa"/>
+            </w:tcMar>
+          </w:tcPr>
+          <w:p>
+            <w:pPr>
+              <w:keepNext w:val="0"/>
+              <w:spacing w:after="20" w:before="20" w:line="245" w:lineRule="auto"/>
+            </w:pPr>
+            <w:r>
+              <w:rPr>
+                <w:b w:val="0"/>
+                <w:sz w:val="18"/>
+              </w:rPr>
+              <w:t>100</w:t>
+            </w:r>
+          </w:p>
+        </w:tc>
+        <w:tc>
+          <w:tcPr>
+            <w:tcW w:type="dxa" w:w="2016"/>
+            <w:vAlign w:val="center"/>
+            <w:shd w:fill="F0F5F8"/>
+            <w:tcMar>
+              <w:top w:w="65" w:type="dxa"/>
+              <w:bottom w:w="65" w:type="dxa"/>
+              <w:left w:w="65" w:type="dxa"/>
+              <w:right w:w="65" w:type="dxa"/>
+            </w:tcMar>
+          </w:tcPr>
+          <w:p>
+            <w:pPr>
+              <w:keepNext w:val="0"/>
+              <w:spacing w:after="20" w:before="20" w:line="245" w:lineRule="auto"/>
+            </w:pPr>
+            <w:r>
+              <w:rPr>
+                <w:b w:val="0"/>
+                <w:sz w:val="18"/>
+              </w:rPr>
+              <w:t>11</w:t>
+            </w:r>
+          </w:p>
+        </w:tc>
+      </w:tr>
+      <w:tr>
+        <w:trPr>
+          <w:cantSplit/>
+        </w:trPr>
+        <w:tc>
+          <w:tcPr>
+            <w:tcW w:type="dxa" w:w="1224"/>
+            <w:vAlign w:val="center"/>
+            <w:shd w:fill="FFFFFF"/>
+            <w:tcMar>
+              <w:top w:w="65" w:type="dxa"/>
+              <w:bottom w:w="65" w:type="dxa"/>
+              <w:left w:w="65" w:type="dxa"/>
+              <w:right w:w="65" w:type="dxa"/>
+            </w:tcMar>
+          </w:tcPr>
+          <w:p>
+            <w:pPr>
+              <w:keepNext w:val="0"/>
+              <w:spacing w:after="20" w:before="20" w:line="245" w:lineRule="auto"/>
+            </w:pPr>
+            <w:r>
+              <w:rPr>
+                <w:b w:val="0"/>
+                <w:sz w:val="18"/>
+              </w:rPr>
+              <w:t>S3</w:t>
+            </w:r>
+          </w:p>
+        </w:tc>
+        <w:tc>
+          <w:tcPr>
+            <w:tcW w:type="dxa" w:w="4622"/>
+            <w:vAlign w:val="center"/>
+            <w:shd w:fill="FFFFFF"/>
+            <w:tcMar>
+              <w:top w:w="65" w:type="dxa"/>
+              <w:bottom w:w="65" w:type="dxa"/>
+              <w:left w:w="65" w:type="dxa"/>
+              <w:right w:w="65" w:type="dxa"/>
+            </w:tcMar>
+          </w:tcPr>
+          <w:p>
+            <w:pPr>
+              <w:keepNext w:val="0"/>
+              <w:spacing w:after="20" w:before="20" w:line="245" w:lineRule="auto"/>
+            </w:pPr>
+            <w:r>
+              <w:rPr>
+                <w:b w:val="0"/>
+                <w:sz w:val="18"/>
+              </w:rPr>
+              <w:t>Dimensions</w:t>
+            </w:r>
+          </w:p>
+        </w:tc>
+        <w:tc>
+          <w:tcPr>
+            <w:tcW w:type="dxa" w:w="2016"/>
+            <w:vAlign w:val="center"/>
+            <w:shd w:fill="FFFFFF"/>
+            <w:tcMar>
+              <w:top w:w="65" w:type="dxa"/>
+              <w:bottom w:w="65" w:type="dxa"/>
+              <w:left w:w="65" w:type="dxa"/>
+              <w:right w:w="65" w:type="dxa"/>
+            </w:tcMar>
+          </w:tcPr>
+          <w:p>
+            <w:pPr>
+              <w:keepNext w:val="0"/>
+              <w:spacing w:after="20" w:before="20" w:line="245" w:lineRule="auto"/>
+            </w:pPr>
+            <w:r>
+              <w:rPr>
+                <w:b w:val="0"/>
+                <w:sz w:val="18"/>
+              </w:rPr>
+              <w:t>36</w:t>
+            </w:r>
+          </w:p>
+        </w:tc>
+        <w:tc>
+          <w:tcPr>
+            <w:tcW w:type="dxa" w:w="2016"/>
+            <w:vAlign w:val="center"/>
+            <w:shd w:fill="FFFFFF"/>
+            <w:tcMar>
+              <w:top w:w="65" w:type="dxa"/>
+              <w:bottom w:w="65" w:type="dxa"/>
+              <w:left w:w="65" w:type="dxa"/>
+              <w:right w:w="65" w:type="dxa"/>
+            </w:tcMar>
+          </w:tcPr>
+          <w:p>
+            <w:pPr>
+              <w:keepNext w:val="0"/>
+              <w:spacing w:after="20" w:before="20" w:line="245" w:lineRule="auto"/>
+            </w:pPr>
+            <w:r>
+              <w:rPr>
+                <w:b w:val="0"/>
+                <w:sz w:val="18"/>
+              </w:rPr>
+              <w:t>5</w:t>
+            </w:r>
+          </w:p>
+        </w:tc>
+      </w:tr>
+      <w:tr>
+        <w:trPr>
+          <w:cantSplit/>
+        </w:trPr>
+        <w:tc>
+          <w:tcPr>
+            <w:tcW w:type="dxa" w:w="1224"/>
+            <w:vAlign w:val="center"/>
+            <w:shd w:fill="F0F5F8"/>
+            <w:tcMar>
+              <w:top w:w="65" w:type="dxa"/>
+              <w:bottom w:w="65" w:type="dxa"/>
+              <w:left w:w="65" w:type="dxa"/>
+              <w:right w:w="65" w:type="dxa"/>
+            </w:tcMar>
+          </w:tcPr>
+          <w:p>
+            <w:pPr>
+              <w:keepNext w:val="0"/>
+              <w:spacing w:after="20" w:before="20" w:line="245" w:lineRule="auto"/>
+            </w:pPr>
+            <w:r>
+              <w:rPr>
+                <w:b w:val="0"/>
+                <w:sz w:val="18"/>
+              </w:rPr>
+              <w:t>S4</w:t>
+            </w:r>
+          </w:p>
+        </w:tc>
+        <w:tc>
+          <w:tcPr>
+            <w:tcW w:type="dxa" w:w="4622"/>
+            <w:vAlign w:val="center"/>
+            <w:shd w:fill="F0F5F8"/>
+            <w:tcMar>
+              <w:top w:w="65" w:type="dxa"/>
+              <w:bottom w:w="65" w:type="dxa"/>
+              <w:left w:w="65" w:type="dxa"/>
+              <w:right w:w="65" w:type="dxa"/>
+            </w:tcMar>
+          </w:tcPr>
+          <w:p>
+            <w:pPr>
+              <w:keepNext w:val="0"/>
+              <w:spacing w:after="20" w:before="20" w:line="245" w:lineRule="auto"/>
+            </w:pPr>
+            <w:r>
+              <w:rPr>
+                <w:b w:val="0"/>
+                <w:sz w:val="18"/>
+              </w:rPr>
+              <w:t>IEEE Xplore</w:t>
+            </w:r>
+          </w:p>
+        </w:tc>
+        <w:tc>
+          <w:tcPr>
+            <w:tcW w:type="dxa" w:w="2016"/>
+            <w:vAlign w:val="center"/>
+            <w:shd w:fill="F0F5F8"/>
+            <w:tcMar>
+              <w:top w:w="65" w:type="dxa"/>
+              <w:bottom w:w="65" w:type="dxa"/>
+              <w:left w:w="65" w:type="dxa"/>
+              <w:right w:w="65" w:type="dxa"/>
+            </w:tcMar>
+          </w:tcPr>
+          <w:p>
+            <w:pPr>
+              <w:keepNext w:val="0"/>
+              <w:spacing w:after="20" w:before="20" w:line="245" w:lineRule="auto"/>
+            </w:pPr>
+            <w:r>
+              <w:rPr>
+                <w:b w:val="0"/>
+                <w:sz w:val="18"/>
+              </w:rPr>
+              <w:t>47</w:t>
+            </w:r>
+          </w:p>
+        </w:tc>
+        <w:tc>
+          <w:tcPr>
+            <w:tcW w:type="dxa" w:w="2016"/>
+            <w:vAlign w:val="center"/>
+            <w:shd w:fill="F0F5F8"/>
+            <w:tcMar>
+              <w:top w:w="65" w:type="dxa"/>
+              <w:bottom w:w="65" w:type="dxa"/>
+              <w:left w:w="65" w:type="dxa"/>
+              <w:right w:w="65" w:type="dxa"/>
+            </w:tcMar>
+          </w:tcPr>
+          <w:p>
+            <w:pPr>
+              <w:keepNext w:val="0"/>
+              <w:spacing w:after="20" w:before="20" w:line="245" w:lineRule="auto"/>
+            </w:pPr>
+            <w:r>
+              <w:rPr>
+                <w:b w:val="0"/>
+                <w:sz w:val="18"/>
+              </w:rPr>
+              <w:t>0</w:t>
+            </w:r>
+          </w:p>
+        </w:tc>
+      </w:tr>
+      <w:tr>
+        <w:trPr>
+          <w:cantSplit/>
+        </w:trPr>
+        <w:tc>
+          <w:tcPr>
+            <w:tcW w:type="dxa" w:w="1224"/>
+            <w:vAlign w:val="center"/>
+            <w:shd w:fill="FFFFFF"/>
+            <w:tcMar>
+              <w:top w:w="65" w:type="dxa"/>
+              <w:bottom w:w="65" w:type="dxa"/>
+              <w:left w:w="65" w:type="dxa"/>
+              <w:right w:w="65" w:type="dxa"/>
+            </w:tcMar>
+          </w:tcPr>
+          <w:p>
+            <w:pPr>
+              <w:keepNext w:val="0"/>
+              <w:spacing w:after="20" w:before="20" w:line="245" w:lineRule="auto"/>
+            </w:pPr>
+            <w:r>
+              <w:rPr>
+                <w:b w:val="0"/>
+                <w:sz w:val="18"/>
+              </w:rPr>
+              <w:t>S5</w:t>
+            </w:r>
+          </w:p>
+        </w:tc>
+        <w:tc>
+          <w:tcPr>
+            <w:tcW w:type="dxa" w:w="4622"/>
+            <w:vAlign w:val="center"/>
+            <w:shd w:fill="FFFFFF"/>
+            <w:tcMar>
+              <w:top w:w="65" w:type="dxa"/>
+              <w:bottom w:w="65" w:type="dxa"/>
+              <w:left w:w="65" w:type="dxa"/>
+              <w:right w:w="65" w:type="dxa"/>
+            </w:tcMar>
+          </w:tcPr>
+          <w:p>
+            <w:pPr>
+              <w:keepNext w:val="0"/>
+              <w:spacing w:after="20" w:before="20" w:line="245" w:lineRule="auto"/>
+            </w:pPr>
+            <w:r>
+              <w:rPr>
+                <w:b w:val="0"/>
+                <w:sz w:val="18"/>
+              </w:rPr>
+              <w:t>SABINET/AJOL</w:t>
+            </w:r>
+          </w:p>
+        </w:tc>
+        <w:tc>
+          <w:tcPr>
+            <w:tcW w:type="dxa" w:w="2016"/>
+            <w:vAlign w:val="center"/>
+            <w:shd w:fill="FFFFFF"/>
+            <w:tcMar>
+              <w:top w:w="65" w:type="dxa"/>
+              <w:bottom w:w="65" w:type="dxa"/>
+              <w:left w:w="65" w:type="dxa"/>
+              <w:right w:w="65" w:type="dxa"/>
+            </w:tcMar>
+          </w:tcPr>
+          <w:p>
+            <w:pPr>
+              <w:keepNext w:val="0"/>
+              <w:spacing w:after="20" w:before="20" w:line="245" w:lineRule="auto"/>
+            </w:pPr>
+            <w:r>
+              <w:rPr>
+                <w:b w:val="0"/>
+                <w:sz w:val="18"/>
+              </w:rPr>
+              <w:t>100</w:t>
+            </w:r>
+          </w:p>
+        </w:tc>
+        <w:tc>
+          <w:tcPr>
+            <w:tcW w:type="dxa" w:w="2016"/>
+            <w:vAlign w:val="center"/>
+            <w:shd w:fill="FFFFFF"/>
+            <w:tcMar>
+              <w:top w:w="65" w:type="dxa"/>
+              <w:bottom w:w="65" w:type="dxa"/>
+              <w:left w:w="65" w:type="dxa"/>
+              <w:right w:w="65" w:type="dxa"/>
+            </w:tcMar>
+          </w:tcPr>
+          <w:p>
+            <w:pPr>
+              <w:keepNext w:val="0"/>
+              <w:spacing w:after="20" w:before="20" w:line="245" w:lineRule="auto"/>
+            </w:pPr>
+            <w:r>
+              <w:rPr>
+                <w:b w:val="0"/>
+                <w:sz w:val="18"/>
+              </w:rPr>
+              <w:t>9</w:t>
+            </w:r>
+          </w:p>
+        </w:tc>
+      </w:tr>
+      <w:tr>
+        <w:trPr>
+          <w:cantSplit/>
+        </w:trPr>
+        <w:tc>
+          <w:tcPr>
+            <w:tcW w:type="dxa" w:w="1224"/>
+            <w:vAlign w:val="center"/>
+            <w:shd w:fill="F0F5F8"/>
+            <w:tcMar>
+              <w:top w:w="65" w:type="dxa"/>
+              <w:bottom w:w="65" w:type="dxa"/>
+              <w:left w:w="65" w:type="dxa"/>
+              <w:right w:w="65" w:type="dxa"/>
+            </w:tcMar>
+          </w:tcPr>
+          <w:p>
+            <w:pPr>
+              <w:keepNext w:val="0"/>
+              <w:spacing w:after="20" w:before="20" w:line="245" w:lineRule="auto"/>
+            </w:pPr>
+            <w:r>
+              <w:rPr>
+                <w:b w:val="0"/>
+                <w:sz w:val="18"/>
+              </w:rPr>
+              <w:t>S6</w:t>
+            </w:r>
+          </w:p>
+        </w:tc>
+        <w:tc>
+          <w:tcPr>
+            <w:tcW w:type="dxa" w:w="4622"/>
+            <w:vAlign w:val="center"/>
+            <w:shd w:fill="F0F5F8"/>
+            <w:tcMar>
+              <w:top w:w="65" w:type="dxa"/>
+              <w:bottom w:w="65" w:type="dxa"/>
+              <w:left w:w="65" w:type="dxa"/>
+              <w:right w:w="65" w:type="dxa"/>
+            </w:tcMar>
+          </w:tcPr>
+          <w:p>
+            <w:pPr>
+              <w:keepNext w:val="0"/>
+              <w:spacing w:after="20" w:before="20" w:line="245" w:lineRule="auto"/>
+            </w:pPr>
+            <w:r>
+              <w:rPr>
+                <w:b w:val="0"/>
+                <w:sz w:val="18"/>
+              </w:rPr>
+              <w:t>Google Scholar</w:t>
+            </w:r>
+          </w:p>
+        </w:tc>
+        <w:tc>
+          <w:tcPr>
+            <w:tcW w:type="dxa" w:w="2016"/>
+            <w:vAlign w:val="center"/>
+            <w:shd w:fill="F0F5F8"/>
+            <w:tcMar>
+              <w:top w:w="65" w:type="dxa"/>
+              <w:bottom w:w="65" w:type="dxa"/>
+              <w:left w:w="65" w:type="dxa"/>
+              <w:right w:w="65" w:type="dxa"/>
+            </w:tcMar>
+          </w:tcPr>
+          <w:p>
+            <w:pPr>
+              <w:keepNext w:val="0"/>
+              <w:spacing w:after="20" w:before="20" w:line="245" w:lineRule="auto"/>
+            </w:pPr>
+            <w:r>
+              <w:rPr>
+                <w:b w:val="0"/>
+                <w:sz w:val="18"/>
+              </w:rPr>
+              <w:t>35</w:t>
+            </w:r>
+          </w:p>
+        </w:tc>
+        <w:tc>
+          <w:tcPr>
+            <w:tcW w:type="dxa" w:w="2016"/>
+            <w:vAlign w:val="center"/>
+            <w:shd w:fill="F0F5F8"/>
+            <w:tcMar>
+              <w:top w:w="65" w:type="dxa"/>
+              <w:bottom w:w="65" w:type="dxa"/>
+              <w:left w:w="65" w:type="dxa"/>
+              <w:right w:w="65" w:type="dxa"/>
+            </w:tcMar>
+          </w:tcPr>
+          <w:p>
+            <w:pPr>
+              <w:keepNext w:val="0"/>
+              <w:spacing w:after="20" w:before="20" w:line="245" w:lineRule="auto"/>
+            </w:pPr>
+            <w:r>
+              <w:rPr>
+                <w:b w:val="0"/>
+                <w:sz w:val="18"/>
+              </w:rPr>
+              <w:t>11</w:t>
+            </w:r>
+          </w:p>
+        </w:tc>
+      </w:tr>
+      <w:tr>
+        <w:trPr>
+          <w:cantSplit/>
+        </w:trPr>
+        <w:tc>
+          <w:tcPr>
+            <w:tcW w:type="dxa" w:w="1224"/>
+            <w:vAlign w:val="center"/>
+            <w:shd w:fill="FFFFFF"/>
+            <w:tcMar>
+              <w:top w:w="65" w:type="dxa"/>
+              <w:bottom w:w="65" w:type="dxa"/>
+              <w:left w:w="65" w:type="dxa"/>
+              <w:right w:w="65" w:type="dxa"/>
+            </w:tcMar>
+          </w:tcPr>
+          <w:p>
+            <w:pPr>
+              <w:keepNext w:val="0"/>
+              <w:spacing w:after="20" w:before="20" w:line="245" w:lineRule="auto"/>
+            </w:pPr>
+            <w:r>
+              <w:rPr>
+                <w:b w:val="0"/>
+                <w:sz w:val="18"/>
+              </w:rPr>
+              <w:t>S7</w:t>
+            </w:r>
+          </w:p>
+        </w:tc>
+        <w:tc>
+          <w:tcPr>
+            <w:tcW w:type="dxa" w:w="4622"/>
+            <w:vAlign w:val="center"/>
+            <w:shd w:fill="FFFFFF"/>
+            <w:tcMar>
+              <w:top w:w="65" w:type="dxa"/>
+              <w:bottom w:w="65" w:type="dxa"/>
+              <w:left w:w="65" w:type="dxa"/>
+              <w:right w:w="65" w:type="dxa"/>
+            </w:tcMar>
+          </w:tcPr>
+          <w:p>
+            <w:pPr>
+              <w:keepNext w:val="0"/>
+              <w:spacing w:after="20" w:before="20" w:line="245" w:lineRule="auto"/>
+            </w:pPr>
+            <w:r>
+              <w:rPr>
+                <w:b w:val="0"/>
+                <w:sz w:val="18"/>
+              </w:rPr>
+              <w:t>DataFirst/Stats SA</w:t>
+            </w:r>
+          </w:p>
+        </w:tc>
+        <w:tc>
+          <w:tcPr>
+            <w:tcW w:type="dxa" w:w="2016"/>
+            <w:vAlign w:val="center"/>
+            <w:shd w:fill="FFFFFF"/>
+            <w:tcMar>
+              <w:top w:w="65" w:type="dxa"/>
+              <w:bottom w:w="65" w:type="dxa"/>
+              <w:left w:w="65" w:type="dxa"/>
+              <w:right w:w="65" w:type="dxa"/>
+            </w:tcMar>
+          </w:tcPr>
+          <w:p>
+            <w:pPr>
+              <w:keepNext w:val="0"/>
+              <w:spacing w:after="20" w:before="20" w:line="245" w:lineRule="auto"/>
+            </w:pPr>
+            <w:r>
+              <w:rPr>
+                <w:b w:val="0"/>
+                <w:sz w:val="18"/>
+              </w:rPr>
+              <w:t>1</w:t>
+            </w:r>
+          </w:p>
+        </w:tc>
+        <w:tc>
+          <w:tcPr>
+            <w:tcW w:type="dxa" w:w="2016"/>
+            <w:vAlign w:val="center"/>
+            <w:shd w:fill="FFFFFF"/>
+            <w:tcMar>
+              <w:top w:w="65" w:type="dxa"/>
+              <w:bottom w:w="65" w:type="dxa"/>
+              <w:left w:w="65" w:type="dxa"/>
+              <w:right w:w="65" w:type="dxa"/>
+            </w:tcMar>
+          </w:tcPr>
+          <w:p>
+            <w:pPr>
+              <w:keepNext w:val="0"/>
+              <w:spacing w:after="20" w:before="20" w:line="245" w:lineRule="auto"/>
+            </w:pPr>
+            <w:r>
+              <w:rPr>
+                <w:b w:val="0"/>
+                <w:sz w:val="18"/>
+              </w:rPr>
+              <w:t>0</w:t>
+            </w:r>
+          </w:p>
+        </w:tc>
+      </w:tr>
+    </w:tbl>
+    <w:p>
+      <w:pPr>
+        <w:spacing w:after="0"/>
+      </w:pPr>
+    </w:p>
+    <w:p>
+      <w:r>
+        <w:rPr>
+          <w:b w:val="0"/>
+        </w:rPr>
+        <w:t xml:space="preserve">The recorded hits sum to </w:t>
+      </w:r>
+      <w:r>
+        <w:rPr>
+          <w:b/>
+        </w:rPr>
+        <w:t>511</w:t>
+      </w:r>
+      <w:r>
+        <w:rPr>
+          <w:b w:val="0"/>
+        </w:rPr>
+        <w:t xml:space="preserve"> and the retained-source counts sum to </w:t>
+      </w:r>
+      <w:r>
+        <w:rPr>
+          <w:b/>
+        </w:rPr>
+        <w:t>55</w:t>
+      </w:r>
+      <w:r>
+        <w:rPr>
+          <w:b w:val="0"/>
+        </w:rPr>
+        <w:t>. These arithmetic totals were checked. The searches were not rerun and the underlying workbook was not inspected. Exact strings are available in the linked record; they should not be described as wholly unavailable.</w:t>
+      </w:r>
+    </w:p>
+    <w:p>
+      <w:pPr>
+        <w:spacing w:after="100"/>
+      </w:pPr>
+      <w:hyperlink r:id="rId12">
+        <w:r>
+          <w:rPr>
+            <w:color w:val="245D88"/>
+            <w:u w:val="single"/>
+            <w:sz w:val="19"/>
+          </w:rPr>
+          <w:t>Recorded search strings, platforms, date and counts</w:t>
+        </w:r>
+      </w:hyperlink>
+    </w:p>
+    <w:p>
+      <w:pPr>
+        <w:pStyle w:val="Heading3"/>
+      </w:pPr>
+      <w:r>
+        <w:rPr>
+          <w:b w:val="0"/>
+        </w:rPr>
+        <w:t>Actions needed to finish missing item 1</w:t>
+      </w:r>
+    </w:p>
+    <w:p>
+      <w:pPr>
+        <w:ind w:left="288" w:hanging="288"/>
+      </w:pPr>
+      <w:r>
+        <w:rPr>
+          <w:b w:val="0"/>
+        </w:rPr>
+        <w:t xml:space="preserve">1. </w:t>
+      </w:r>
+      <w:r>
+        <w:rPr>
+          <w:b/>
+        </w:rPr>
+        <w:t>Package the existing S1–S4 supplement</w:t>
+      </w:r>
+      <w:r>
+        <w:rPr>
+          <w:b w:val="0"/>
+        </w:rPr>
+        <w:t xml:space="preserve"> with the paper and retain its links to the appropriate aggregate output files. A reference to a supplement is not a substitute for supplying it to reviewers.</w:t>
+      </w:r>
+    </w:p>
+    <w:p>
+      <w:pPr>
+        <w:ind w:left="288" w:hanging="288"/>
+      </w:pPr>
+      <w:r>
+        <w:rPr>
+          <w:b w:val="0"/>
+        </w:rPr>
+        <w:t xml:space="preserve">2. </w:t>
+      </w:r>
+      <w:r>
+        <w:rPr>
+          <w:b/>
+        </w:rPr>
+        <w:t>Resolve the S2 preprocessing qualification.</w:t>
+      </w:r>
+      <w:r>
+        <w:rPr>
+          <w:b w:val="0"/>
+        </w:rPr>
+        <w:t xml:space="preserve"> Use inner-training-only imputation in the reusable tuning pipeline. If the procedure is rerun, retain its updated metrics, penalties and convergence records and reconcile the paper and S2.</w:t>
+      </w:r>
+    </w:p>
+    <w:p>
+      <w:pPr>
+        <w:ind w:left="288" w:hanging="288"/>
+      </w:pPr>
+      <w:r>
+        <w:rPr>
+          <w:b w:val="0"/>
+        </w:rPr>
+        <w:t xml:space="preserve">3. </w:t>
+      </w:r>
+      <w:r>
+        <w:rPr>
+          <w:b/>
+        </w:rPr>
+        <w:t>Retain the S3 trace.</w:t>
+      </w:r>
+      <w:r>
+        <w:rPr>
+          <w:b w:val="0"/>
+        </w:rPr>
+        <w:t xml:space="preserve"> Keep the 20 per-repetition metric rows and 100 fit/coefficient records. Any fresh predictive-performance reproduction should preserve controlled per-repetition predictions and the code/environment record.</w:t>
+      </w:r>
+    </w:p>
+    <w:p>
+      <w:pPr>
+        <w:ind w:left="288" w:hanging="288"/>
+      </w:pPr>
+      <w:r>
+        <w:rPr>
+          <w:b w:val="0"/>
+        </w:rPr>
+        <w:t xml:space="preserve">4. </w:t>
+      </w:r>
+      <w:r>
+        <w:rPr>
+          <w:b/>
+        </w:rPr>
+        <w:t>Recover the original S5 workbook and exports.</w:t>
+      </w:r>
+      <w:r>
+        <w:rPr>
+          <w:b w:val="0"/>
+        </w:rPr>
+        <w:t xml:space="preserve"> Record versions/checksums, exact query syntax, platform, date, filters, recorded hits and exported row counts. Distinguish calculated count differences from observed duplicate records when reconciling 511 hits with 375 unique records.</w:t>
+      </w:r>
+    </w:p>
+    <w:p>
+      <w:pPr>
+        <w:ind w:left="288" w:hanging="288"/>
+      </w:pPr>
+      <w:r>
+        <w:rPr>
+          <w:b w:val="0"/>
+        </w:rPr>
+        <w:t xml:space="preserve">5. </w:t>
+      </w:r>
+      <w:r>
+        <w:rPr>
+          <w:b/>
+        </w:rPr>
+        <w:t>Check item-level selection and extraction.</w:t>
+      </w:r>
+      <w:r>
+        <w:rPr>
+          <w:b w:val="0"/>
+        </w:rPr>
+        <w:t xml:space="preserve"> Trace the 375 records through screening, 153 full texts and 55 retained sources. Preserve genuinely missing reasons as missing. Verify the PDF’s statements about two uncoded title/abstract exclusions, 98 coded full-text exclusions and one extraction-example row against the actual files; do not invent missing reasons or 55 completed extraction rows.</w:t>
+      </w:r>
+    </w:p>
+    <w:p>
+      <w:pPr>
+        <w:ind w:left="288" w:hanging="288"/>
+      </w:pPr>
+      <w:r>
+        <w:rPr>
+          <w:b w:val="0"/>
+        </w:rPr>
+        <w:t xml:space="preserve">6. </w:t>
+      </w:r>
+      <w:r>
+        <w:rPr>
+          <w:b/>
+        </w:rPr>
+        <w:t>Cross-reference the completed S5 and supporting files.</w:t>
+      </w:r>
+      <w:r>
+        <w:rPr>
+          <w:b w:val="0"/>
+        </w:rPr>
+        <w:t xml:space="preserve"> Until those records are available, describe the position as: “Recorded search details are available; the underlying screening audit has not been independently verified.”</w:t>
+      </w:r>
+    </w:p>
+    <w:p>
+      <w:r>
+        <w:rPr>
+          <w:b w:val="0"/>
+        </w:rPr>
+      </w:r>
+      <w:r>
+        <w:rPr>
+          <w:b/>
+        </w:rPr>
+        <w:t>Completion boundary:</w:t>
+      </w:r>
+      <w:r>
+        <w:rPr>
+          <w:b w:val="0"/>
+        </w:rPr>
+        <w:t xml:space="preserve"> this addendum records the checks performed and the remaining evidence needs. It adds only missing item 1; it does not claim that every supervisor correction or the complete publication review is closed.</w:t>
       </w:r>
     </w:p>
     <w:sectPr>

</xml_diff>